<commit_message>
feat: decouple backend v2, support standalone local AI via .env, and clean UI
- Load AI API key and model directly from .env with automatic emulator localhost mapping
- Remove mandatory auth redirect to allow full offline-first usage from Home screen
- Clean up markdown heading rendering (###) in AI message bubbles
- Remove obsolete v2 recommendation banner from PantryScreen
- Standardize all screen branding and labels to Cooking Note
- Add source zip creation and document styling scripts

Co-Authored-By: Claude <noreply@anthropic.com>
</commit_message>
<xml_diff>
--- a/docs/CookingNote_BaoCao.docx
+++ b/docs/CookingNote_BaoCao.docx
@@ -102,7 +102,21 @@
           <w:b/>
           <w:bCs/>
         </w:rPr>
-        <w:t>MÔN: PHÁT TRIỂN ỨNG DỤNG DI ĐỘNG</w:t>
+        <w:t>MÔN</w:t>
+      </w:r>
+      <w:r>
+        <w:rPr>
+          <w:b/>
+          <w:bCs/>
+        </w:rPr>
+        <w:t xml:space="preserve">: </w:t>
+      </w:r>
+      <w:r>
+        <w:rPr>
+          <w:b/>
+          <w:bCs/>
+        </w:rPr>
+        <w:t>PHÁT TRIỂN ỨNG DỤNG TRÊN THIẾT BỊ DI ĐỘNG</w:t>
       </w:r>
     </w:p>
     <w:p>
@@ -134,7 +148,17 @@
           <w:sz w:val="30"/>
           <w:szCs w:val="30"/>
         </w:rPr>
-        <w:t>(COOKING NOTE)</w:t>
+        <w:t>(COOKING NOTE</w:t>
+      </w:r>
+      <w:r>
+        <w:rPr>
+          <w:b/>
+          <w:bCs/>
+          <w:color w:val="1F4E79"/>
+          <w:sz w:val="30"/>
+          <w:szCs w:val="30"/>
+        </w:rPr>
+        <w:t>)</w:t>
       </w:r>
     </w:p>
     <w:p>
@@ -169,12 +193,15 @@
       <w:pPr>
         <w:spacing w:after="40"/>
         <w:jc w:val="center"/>
-      </w:pPr>
-      <w:r>
         <w:rPr>
           <w:b/>
         </w:rPr>
-        <w:t>Nhóm sinh viên thực hiện (Lớp: TT602-K16LT):</w:t>
+      </w:pPr>
+      <w:r>
+        <w:rPr>
+          <w:b/>
+        </w:rPr>
+        <w:t>Nhóm sinh viên thực hiện</w:t>
       </w:r>
     </w:p>
     <w:p>
@@ -184,9 +211,63 @@
       </w:pPr>
       <w:r>
         <w:rPr>
+          <w:b/>
+        </w:rPr>
+        <w:t>Nhóm 3 -</w:t>
+      </w:r>
+      <w:r>
+        <w:rPr>
+          <w:b/>
+        </w:rPr>
+        <w:t xml:space="preserve"> Lớp: TT602-K16L</w:t>
+      </w:r>
+      <w:r>
+        <w:rPr>
+          <w:b/>
+        </w:rPr>
+        <w:t>T</w:t>
+      </w:r>
+      <w:r>
+        <w:rPr>
+          <w:b/>
+        </w:rPr>
+        <w:t>:</w:t>
+      </w:r>
+    </w:p>
+    <w:p>
+      <w:pPr>
+        <w:spacing w:after="40"/>
+        <w:jc w:val="center"/>
+      </w:pPr>
+      <w:r>
+        <w:rPr>
           <w:sz w:val="24"/>
         </w:rPr>
-        <w:t>1. Vũ Đình Đạo (Nhóm trưởng)          2. Ngô Gia Bảo</w:t>
+        <w:t xml:space="preserve">1. Vũ Đình Đạo </w:t>
+      </w:r>
+      <w:r>
+        <w:rPr>
+          <w:sz w:val="24"/>
+        </w:rPr>
+        <w:tab/>
+      </w:r>
+      <w:r>
+        <w:rPr>
+          <w:sz w:val="24"/>
+        </w:rPr>
+        <w:t>2. Ngô Gia Bảo</w:t>
+      </w:r>
+      <w:r>
+        <w:rPr>
+          <w:sz w:val="24"/>
+        </w:rPr>
+        <w:t xml:space="preserve"> </w:t>
+      </w:r>
+      <w:r>
+        <w:rPr>
+          <w:sz w:val="24"/>
+        </w:rPr>
+        <w:t xml:space="preserve">(Nhóm trưởng)          </w:t>
       </w:r>
       <w:r>
         <w:rPr>
@@ -1264,576 +1345,6 @@
           <w:bCs/>
           <w:color w:val="1F4E79"/>
           <w:lang w:val="pt-BR"/>
-        </w:rPr>
-        <w:lastRenderedPageBreak/>
-        <w:t>LỜI CAM ĐOAN</w:t>
-      </w:r>
-    </w:p>
-    <w:p>
-      <w:pPr>
-        <w:spacing w:after="160" w:line="360" w:lineRule="auto"/>
-        <w:jc w:val="both"/>
-        <w:rPr>
-          <w:lang w:val="pt-BR"/>
-        </w:rPr>
-      </w:pPr>
-      <w:r>
-        <w:rPr>
-          <w:lang w:val="pt-BR"/>
-        </w:rPr>
-        <w:t>Chúng em xin cam đoan đồ án “Sổ tay Công thức Nấu ăn – Cooking Note” là sản phẩm do chính nhóm nghiên cứu, phân tích, thiết kế và xây dựng dựa trên kiến thức đã học cùng quá trình tự tìm hiểu thêm tài liệu chính thức từ Google, OpenAI, Anthropic. Các nội dung tham khảo từ tài liệu bên ngoài đều được trích dẫn nguồn rõ ràng tại mục Tài liệu tham khảo. Chúng em xin chịu hoàn toàn trách nhiệm nếu có bất kỳ sự sao chép không hợp lệ nào.</w:t>
-      </w:r>
-    </w:p>
-    <w:p>
-      <w:pPr>
-        <w:spacing w:after="160" w:line="360" w:lineRule="auto"/>
-        <w:jc w:val="right"/>
-        <w:rPr>
-          <w:lang w:val="pt-BR"/>
-        </w:rPr>
-      </w:pPr>
-      <w:r>
-        <w:rPr>
-          <w:lang w:val="pt-BR"/>
-        </w:rPr>
-        <w:t>Nhóm thực hiện</w:t>
-      </w:r>
-    </w:p>
-    <w:p>
-      <w:pPr>
-        <w:pStyle w:val="Heading1"/>
-        <w:pageBreakBefore/>
-        <w:spacing w:after="300"/>
-        <w:jc w:val="center"/>
-        <w:rPr>
-          <w:lang w:val="pt-BR"/>
-        </w:rPr>
-      </w:pPr>
-      <w:r>
-        <w:rPr>
-          <w:b/>
-          <w:bCs/>
-          <w:color w:val="1F4E79"/>
-          <w:lang w:val="pt-BR"/>
-        </w:rPr>
-        <w:lastRenderedPageBreak/>
-        <w:t>NHẬN XÉT CỦA GIẢNG VIÊN HƯỚNG DẪN</w:t>
-      </w:r>
-    </w:p>
-    <w:p>
-      <w:pPr>
-        <w:spacing w:after="500" w:line="360" w:lineRule="auto"/>
-        <w:jc w:val="both"/>
-        <w:rPr>
-          <w:lang w:val="pt-BR"/>
-        </w:rPr>
-      </w:pPr>
-      <w:r>
-        <w:rPr>
-          <w:lang w:val="pt-BR"/>
-        </w:rPr>
-        <w:t>....................................................................................................................................................</w:t>
-      </w:r>
-    </w:p>
-    <w:p>
-      <w:pPr>
-        <w:spacing w:after="500" w:line="360" w:lineRule="auto"/>
-        <w:jc w:val="both"/>
-        <w:rPr>
-          <w:lang w:val="pt-BR"/>
-        </w:rPr>
-      </w:pPr>
-      <w:r>
-        <w:rPr>
-          <w:lang w:val="pt-BR"/>
-        </w:rPr>
-        <w:t>....................................................................................................................................................</w:t>
-      </w:r>
-    </w:p>
-    <w:p>
-      <w:pPr>
-        <w:spacing w:after="500" w:line="360" w:lineRule="auto"/>
-        <w:jc w:val="both"/>
-        <w:rPr>
-          <w:lang w:val="pt-BR"/>
-        </w:rPr>
-      </w:pPr>
-      <w:r>
-        <w:rPr>
-          <w:lang w:val="pt-BR"/>
-        </w:rPr>
-        <w:t>....................................................................................................................................................</w:t>
-      </w:r>
-    </w:p>
-    <w:p>
-      <w:pPr>
-        <w:spacing w:after="500" w:line="360" w:lineRule="auto"/>
-        <w:jc w:val="both"/>
-        <w:rPr>
-          <w:lang w:val="pt-BR"/>
-        </w:rPr>
-      </w:pPr>
-      <w:r>
-        <w:rPr>
-          <w:lang w:val="pt-BR"/>
-        </w:rPr>
-        <w:t>....................................................................................................................................................</w:t>
-      </w:r>
-    </w:p>
-    <w:p>
-      <w:pPr>
-        <w:spacing w:after="500" w:line="360" w:lineRule="auto"/>
-        <w:jc w:val="both"/>
-        <w:rPr>
-          <w:lang w:val="pt-BR"/>
-        </w:rPr>
-      </w:pPr>
-      <w:r>
-        <w:rPr>
-          <w:lang w:val="pt-BR"/>
-        </w:rPr>
-        <w:t>....................................................................................................................................................</w:t>
-      </w:r>
-    </w:p>
-    <w:p>
-      <w:pPr>
-        <w:spacing w:after="500" w:line="360" w:lineRule="auto"/>
-        <w:jc w:val="both"/>
-        <w:rPr>
-          <w:lang w:val="pt-BR"/>
-        </w:rPr>
-      </w:pPr>
-      <w:r>
-        <w:rPr>
-          <w:lang w:val="pt-BR"/>
-        </w:rPr>
-        <w:t>....................................................................................................................................................</w:t>
-      </w:r>
-    </w:p>
-    <w:p>
-      <w:pPr>
-        <w:spacing w:after="500" w:line="360" w:lineRule="auto"/>
-        <w:jc w:val="both"/>
-        <w:rPr>
-          <w:lang w:val="pt-BR"/>
-        </w:rPr>
-      </w:pPr>
-      <w:r>
-        <w:rPr>
-          <w:lang w:val="pt-BR"/>
-        </w:rPr>
-        <w:t>....................................................................................................................................................</w:t>
-      </w:r>
-    </w:p>
-    <w:p>
-      <w:pPr>
-        <w:spacing w:after="800" w:line="360" w:lineRule="auto"/>
-        <w:jc w:val="both"/>
-        <w:rPr>
-          <w:lang w:val="pt-BR"/>
-        </w:rPr>
-      </w:pPr>
-      <w:r>
-        <w:rPr>
-          <w:lang w:val="pt-BR"/>
-        </w:rPr>
-        <w:t>Điểm số: ...................................  (Bằng chữ: ..............................................................)</w:t>
-      </w:r>
-    </w:p>
-    <w:p>
-      <w:pPr>
-        <w:spacing w:after="40" w:line="360" w:lineRule="auto"/>
-        <w:jc w:val="right"/>
-        <w:rPr>
-          <w:lang w:val="pt-BR"/>
-        </w:rPr>
-      </w:pPr>
-      <w:r>
-        <w:rPr>
-          <w:lang w:val="pt-BR"/>
-        </w:rPr>
-        <w:t>Hà Nội, ngày ..... tháng ..... năm 2026</w:t>
-      </w:r>
-    </w:p>
-    <w:p>
-      <w:pPr>
-        <w:spacing w:after="40" w:line="360" w:lineRule="auto"/>
-        <w:jc w:val="right"/>
-        <w:rPr>
-          <w:lang w:val="pt-BR"/>
-        </w:rPr>
-      </w:pPr>
-      <w:r>
-        <w:rPr>
-          <w:lang w:val="pt-BR"/>
-        </w:rPr>
-        <w:t>Giảng viên hướng dẫn</w:t>
-      </w:r>
-    </w:p>
-    <w:p>
-      <w:pPr>
-        <w:spacing w:after="160" w:line="360" w:lineRule="auto"/>
-        <w:jc w:val="right"/>
-        <w:rPr>
-          <w:lang w:val="pt-BR"/>
-        </w:rPr>
-      </w:pPr>
-      <w:r>
-        <w:rPr>
-          <w:i/>
-          <w:iCs/>
-          <w:lang w:val="pt-BR"/>
-        </w:rPr>
-        <w:t>(Ký và ghi rõ họ tên)</w:t>
-      </w:r>
-    </w:p>
-    <w:p>
-      <w:pPr>
-        <w:pStyle w:val="Heading1"/>
-        <w:pageBreakBefore/>
-        <w:spacing w:after="300"/>
-        <w:jc w:val="center"/>
-        <w:rPr>
-          <w:lang w:val="pt-BR"/>
-        </w:rPr>
-      </w:pPr>
-      <w:r>
-        <w:rPr>
-          <w:b/>
-          <w:bCs/>
-          <w:color w:val="1F4E79"/>
-          <w:lang w:val="pt-BR"/>
-        </w:rPr>
-        <w:lastRenderedPageBreak/>
-        <w:t>NHẬN XÉT CỦA GIẢNG VIÊN PHẢN BIỆN</w:t>
-      </w:r>
-    </w:p>
-    <w:p>
-      <w:pPr>
-        <w:spacing w:after="500" w:line="360" w:lineRule="auto"/>
-        <w:jc w:val="both"/>
-        <w:rPr>
-          <w:lang w:val="pt-BR"/>
-        </w:rPr>
-      </w:pPr>
-      <w:r>
-        <w:rPr>
-          <w:lang w:val="pt-BR"/>
-        </w:rPr>
-        <w:t>....................................................................................................................................................</w:t>
-      </w:r>
-    </w:p>
-    <w:p>
-      <w:pPr>
-        <w:spacing w:after="500" w:line="360" w:lineRule="auto"/>
-        <w:jc w:val="both"/>
-        <w:rPr>
-          <w:lang w:val="pt-BR"/>
-        </w:rPr>
-      </w:pPr>
-      <w:r>
-        <w:rPr>
-          <w:lang w:val="pt-BR"/>
-        </w:rPr>
-        <w:t>....................................................................................................................................................</w:t>
-      </w:r>
-    </w:p>
-    <w:p>
-      <w:pPr>
-        <w:spacing w:after="500" w:line="360" w:lineRule="auto"/>
-        <w:jc w:val="both"/>
-        <w:rPr>
-          <w:lang w:val="pt-BR"/>
-        </w:rPr>
-      </w:pPr>
-      <w:r>
-        <w:rPr>
-          <w:lang w:val="pt-BR"/>
-        </w:rPr>
-        <w:t>....................................................................................................................................................</w:t>
-      </w:r>
-    </w:p>
-    <w:p>
-      <w:pPr>
-        <w:spacing w:after="500" w:line="360" w:lineRule="auto"/>
-        <w:jc w:val="both"/>
-        <w:rPr>
-          <w:lang w:val="pt-BR"/>
-        </w:rPr>
-      </w:pPr>
-      <w:r>
-        <w:rPr>
-          <w:lang w:val="pt-BR"/>
-        </w:rPr>
-        <w:t>....................................................................................................................................................</w:t>
-      </w:r>
-    </w:p>
-    <w:p>
-      <w:pPr>
-        <w:spacing w:after="500" w:line="360" w:lineRule="auto"/>
-        <w:jc w:val="both"/>
-        <w:rPr>
-          <w:lang w:val="pt-BR"/>
-        </w:rPr>
-      </w:pPr>
-      <w:r>
-        <w:rPr>
-          <w:lang w:val="pt-BR"/>
-        </w:rPr>
-        <w:t>....................................................................................................................................................</w:t>
-      </w:r>
-    </w:p>
-    <w:p>
-      <w:pPr>
-        <w:spacing w:after="500" w:line="360" w:lineRule="auto"/>
-        <w:jc w:val="both"/>
-        <w:rPr>
-          <w:lang w:val="pt-BR"/>
-        </w:rPr>
-      </w:pPr>
-      <w:r>
-        <w:rPr>
-          <w:lang w:val="pt-BR"/>
-        </w:rPr>
-        <w:t>....................................................................................................................................................</w:t>
-      </w:r>
-    </w:p>
-    <w:p>
-      <w:pPr>
-        <w:spacing w:after="500" w:line="360" w:lineRule="auto"/>
-        <w:jc w:val="both"/>
-        <w:rPr>
-          <w:lang w:val="pt-BR"/>
-        </w:rPr>
-      </w:pPr>
-      <w:r>
-        <w:rPr>
-          <w:lang w:val="pt-BR"/>
-        </w:rPr>
-        <w:t>....................................................................................................................................................</w:t>
-      </w:r>
-    </w:p>
-    <w:p>
-      <w:pPr>
-        <w:spacing w:after="800" w:line="360" w:lineRule="auto"/>
-        <w:jc w:val="both"/>
-        <w:rPr>
-          <w:lang w:val="pt-BR"/>
-        </w:rPr>
-      </w:pPr>
-      <w:r>
-        <w:rPr>
-          <w:lang w:val="pt-BR"/>
-        </w:rPr>
-        <w:t>Điểm số: ...................................  (Bằng chữ: ..............................................................)</w:t>
-      </w:r>
-    </w:p>
-    <w:p>
-      <w:pPr>
-        <w:spacing w:after="40" w:line="360" w:lineRule="auto"/>
-        <w:jc w:val="right"/>
-        <w:rPr>
-          <w:lang w:val="pt-BR"/>
-        </w:rPr>
-      </w:pPr>
-      <w:r>
-        <w:rPr>
-          <w:lang w:val="pt-BR"/>
-        </w:rPr>
-        <w:t>Hà Nội, ngày ..... tháng ..... năm 2026</w:t>
-      </w:r>
-    </w:p>
-    <w:p>
-      <w:pPr>
-        <w:spacing w:after="40" w:line="360" w:lineRule="auto"/>
-        <w:jc w:val="right"/>
-        <w:rPr>
-          <w:lang w:val="pt-BR"/>
-        </w:rPr>
-      </w:pPr>
-      <w:r>
-        <w:rPr>
-          <w:lang w:val="pt-BR"/>
-        </w:rPr>
-        <w:t>Giảng viên phản biện</w:t>
-      </w:r>
-    </w:p>
-    <w:p>
-      <w:pPr>
-        <w:spacing w:after="160" w:line="360" w:lineRule="auto"/>
-        <w:jc w:val="right"/>
-        <w:rPr>
-          <w:lang w:val="pt-BR"/>
-        </w:rPr>
-      </w:pPr>
-      <w:r>
-        <w:rPr>
-          <w:i/>
-          <w:iCs/>
-          <w:lang w:val="pt-BR"/>
-        </w:rPr>
-        <w:t>(Ký và ghi rõ họ tên)</w:t>
-      </w:r>
-    </w:p>
-    <w:p>
-      <w:pPr>
-        <w:pStyle w:val="Heading1"/>
-        <w:pageBreakBefore/>
-        <w:spacing w:after="300"/>
-        <w:jc w:val="center"/>
-        <w:rPr>
-          <w:lang w:val="pt-BR"/>
-        </w:rPr>
-      </w:pPr>
-      <w:r>
-        <w:rPr>
-          <w:b/>
-          <w:bCs/>
-          <w:color w:val="1F4E79"/>
-          <w:lang w:val="pt-BR"/>
-        </w:rPr>
-        <w:lastRenderedPageBreak/>
-        <w:t>LỜI MỞ ĐẦU</w:t>
-      </w:r>
-    </w:p>
-    <w:p>
-      <w:pPr>
-        <w:spacing w:after="160" w:line="360" w:lineRule="auto"/>
-        <w:jc w:val="both"/>
-        <w:rPr>
-          <w:lang w:val="pt-BR"/>
-        </w:rPr>
-      </w:pPr>
-      <w:r>
-        <w:rPr>
-          <w:lang w:val="pt-BR"/>
-        </w:rPr>
-        <w:t>Thật ra lúc đầu tụi em không hình dung được rõ ràng nên chọn đề tài gì. Loay hoay mãi, tụi em mới nhận ra một chuyện rất đời thường: buổi tối nào cũng có lúc đứng trước tủ lạnh, nhìn mấy quả trứng với ít rau còn sót lại mà không biết nên nấu món gì cho hợp. Cái cảm giác “có đồ ăn trong nhà mà vẫn không biết nấu gì” nghe có vẻ nhỏ nhặt, nhưng lặp đi lặp lại hoài thì cũng thấy phiền thật sự. Từ chuyện nhỏ đó, tụi em nghĩ: hay là mình làm một cái app giúp chính mình (và có thể giúp người khác) đỡ phải đau đầu mỗi lần vào bếp?</w:t>
-      </w:r>
-    </w:p>
-    <w:p>
-      <w:pPr>
-        <w:spacing w:after="160" w:line="360" w:lineRule="auto"/>
-        <w:jc w:val="both"/>
-        <w:rPr>
-          <w:lang w:val="pt-BR"/>
-        </w:rPr>
-      </w:pPr>
-      <w:r>
-        <w:rPr>
-          <w:lang w:val="pt-BR"/>
-        </w:rPr>
-        <w:t>Vậy là “Sổ tay Công thức Nấu ăn – Cooking Note” ra đời, không phải vì tụi em là dân công nghệ giỏi giang gì, mà đơn giản vì tụi em muốn thử sức làm một sản phẩm có ích thật sự, dù nhỏ. Ứng dụng không chỉ để lưu công thức cho khỏi quên, mà còn giúp theo dõi tủ lạnh đang có gì, món nào hay nấu, và có một “người bạn” AI để hỏi han mỗi khi bí ý tưởng. Tụi em cũng không phải chuyên gia gì về trí tuệ nhân tạo, chỉ là biết chút ít, đọc tài liệu, thử nghiệm, sai rồi sửa, dần dần mới ráp lại được thành một ứng dụng chạy được.</w:t>
-      </w:r>
-    </w:p>
-    <w:p>
-      <w:pPr>
-        <w:spacing w:after="160" w:line="360" w:lineRule="auto"/>
-        <w:jc w:val="both"/>
-        <w:rPr>
-          <w:lang w:val="pt-BR"/>
-        </w:rPr>
-      </w:pPr>
-      <w:r>
-        <w:rPr>
-          <w:lang w:val="pt-BR"/>
-        </w:rPr>
-        <w:t>Cái khó nhất có lẽ là làm sao để app vẫn “thông minh” mà không quá lệ thuộc vào Internet, vì tụi em hiểu cảm giác đang cần gấp mà mạng lại chập chờn. Nên tụi em cố gắng thiết kế thêm một phương án dự phòng, để dù có mất mạng thì ứng dụng vẫn gợi ý được món gì đó, dù đơn giản hơn một chút cũng không sao. Có lẽ đây không phải là một sản phẩm hoàn hảo, còn rất nhiều chỗ tụi em biết là chưa tới, nhưng nó là kết quả của những buổi tối ngồi mày mò, sửa lỗi, rồi vui mừng khi cuối cùng cũng chạy được. Tụi em xin phép trình bày lại toàn bộ quá trình đó trong báo cáo này, mong nhận được sự thông cảm và góp ý từ thầy cô.</w:t>
-      </w:r>
-    </w:p>
-    <w:p>
-      <w:pPr>
-        <w:pStyle w:val="Heading1"/>
-        <w:pageBreakBefore/>
-        <w:spacing w:after="300"/>
-        <w:jc w:val="center"/>
-        <w:rPr>
-          <w:lang w:val="pt-BR"/>
-        </w:rPr>
-      </w:pPr>
-      <w:r>
-        <w:rPr>
-          <w:b/>
-          <w:bCs/>
-          <w:color w:val="1F4E79"/>
-          <w:lang w:val="pt-BR"/>
-        </w:rPr>
-        <w:lastRenderedPageBreak/>
-        <w:t>LỜI CẢM ƠN</w:t>
-      </w:r>
-    </w:p>
-    <w:p>
-      <w:pPr>
-        <w:spacing w:after="160" w:line="360" w:lineRule="auto"/>
-        <w:jc w:val="both"/>
-        <w:rPr>
-          <w:lang w:val="pt-BR"/>
-        </w:rPr>
-      </w:pPr>
-      <w:r>
-        <w:rPr>
-          <w:lang w:val="pt-BR"/>
-        </w:rPr>
-        <w:t>Nói thật, có những lúc làm đồ án tụi em cũng thấy nản, vì có nhiều thứ mới quá, đọc tài liệu tiếng Anh mà không hiểu hết, code chạy sai không biết vì sao. Những lúc như vậy, sự động viên và chỉ dẫn của thầy Lê Văn Quân là điều giúp tụi em có động lực đi tiếp. Thầy không chỉ giải đáp thắc mắc kỹ thuật mà còn nhắc tụi em bình tĩnh lại mỗi khi rối, nên tụi em xin gửi lời cảm ơn chân thành nhất đến thầy.</w:t>
-      </w:r>
-    </w:p>
-    <w:p>
-      <w:pPr>
-        <w:spacing w:after="160" w:line="360" w:lineRule="auto"/>
-        <w:jc w:val="both"/>
-        <w:rPr>
-          <w:lang w:val="pt-BR"/>
-        </w:rPr>
-      </w:pPr>
-      <w:r>
-        <w:rPr>
-          <w:lang w:val="pt-BR"/>
-        </w:rPr>
-        <w:t>Tụi em cũng muốn cảm ơn Nhà trường và các thầy cô Khoa Công nghệ Thông tin, vì đã tạo điều kiện cho tụi em được học, được thực hành, được sai và được sửa trong suốt thời gian qua. Nếu không có nền tảng kiến thức đó, chắc tụi em không dám nghĩ đến việc tự làm một ứng dụng hoàn chỉnh như thế này.</w:t>
-      </w:r>
-    </w:p>
-    <w:p>
-      <w:pPr>
-        <w:spacing w:after="160" w:line="360" w:lineRule="auto"/>
-        <w:jc w:val="both"/>
-        <w:rPr>
-          <w:lang w:val="pt-BR"/>
-        </w:rPr>
-      </w:pPr>
-      <w:r>
-        <w:rPr>
-          <w:lang w:val="pt-BR"/>
-        </w:rPr>
-        <w:t>Đồ án chắc chắn còn nhiều thiếu sót, có chỗ tụi em làm chưa tới, có chỗ hiểu chưa sâu, mong thầy cô thông cảm và góp ý thêm để tụi em rút kinh nghiệm cho những lần sau.</w:t>
-      </w:r>
-    </w:p>
-    <w:p>
-      <w:pPr>
-        <w:spacing w:after="160" w:line="360" w:lineRule="auto"/>
-        <w:jc w:val="both"/>
-        <w:rPr>
-          <w:lang w:val="pt-BR"/>
-        </w:rPr>
-      </w:pPr>
-      <w:r>
-        <w:rPr>
-          <w:lang w:val="pt-BR"/>
-        </w:rPr>
-        <w:t>Tụi em xin chân thành cảm ơn!</w:t>
-      </w:r>
-    </w:p>
-    <w:p>
-      <w:pPr>
-        <w:pStyle w:val="Heading1"/>
-        <w:pageBreakBefore/>
-        <w:spacing w:after="300"/>
-        <w:jc w:val="center"/>
-      </w:pPr>
-      <w:r>
-        <w:rPr>
-          <w:b/>
-          <w:bCs/>
-          <w:color w:val="1F4E79"/>
         </w:rPr>
         <w:lastRenderedPageBreak/>
         <w:t>DANH MỤC TỪ VIẾT TẮT</w:t>
@@ -1861,12 +1372,6 @@
         <w:gridCol w:w="6800"/>
       </w:tblGrid>
       <w:tr>
-        <w:tblPrEx>
-          <w:tblCellMar>
-            <w:top w:w="0" w:type="dxa"/>
-            <w:bottom w:w="0" w:type="dxa"/>
-          </w:tblCellMar>
-        </w:tblPrEx>
         <w:trPr>
           <w:tblHeader/>
         </w:trPr>
@@ -1926,12 +1431,6 @@
         </w:tc>
       </w:tr>
       <w:tr>
-        <w:tblPrEx>
-          <w:tblCellMar>
-            <w:top w:w="0" w:type="dxa"/>
-            <w:bottom w:w="0" w:type="dxa"/>
-          </w:tblCellMar>
-        </w:tblPrEx>
         <w:tc>
           <w:tcPr>
             <w:tcW w:w="2200" w:type="dxa"/>
@@ -1976,12 +1475,6 @@
         </w:tc>
       </w:tr>
       <w:tr>
-        <w:tblPrEx>
-          <w:tblCellMar>
-            <w:top w:w="0" w:type="dxa"/>
-            <w:bottom w:w="0" w:type="dxa"/>
-          </w:tblCellMar>
-        </w:tblPrEx>
         <w:tc>
           <w:tcPr>
             <w:tcW w:w="2200" w:type="dxa"/>
@@ -2026,12 +1519,6 @@
         </w:tc>
       </w:tr>
       <w:tr>
-        <w:tblPrEx>
-          <w:tblCellMar>
-            <w:top w:w="0" w:type="dxa"/>
-            <w:bottom w:w="0" w:type="dxa"/>
-          </w:tblCellMar>
-        </w:tblPrEx>
         <w:tc>
           <w:tcPr>
             <w:tcW w:w="2200" w:type="dxa"/>
@@ -2076,12 +1563,6 @@
         </w:tc>
       </w:tr>
       <w:tr>
-        <w:tblPrEx>
-          <w:tblCellMar>
-            <w:top w:w="0" w:type="dxa"/>
-            <w:bottom w:w="0" w:type="dxa"/>
-          </w:tblCellMar>
-        </w:tblPrEx>
         <w:tc>
           <w:tcPr>
             <w:tcW w:w="2200" w:type="dxa"/>
@@ -2126,12 +1607,6 @@
         </w:tc>
       </w:tr>
       <w:tr>
-        <w:tblPrEx>
-          <w:tblCellMar>
-            <w:top w:w="0" w:type="dxa"/>
-            <w:bottom w:w="0" w:type="dxa"/>
-          </w:tblCellMar>
-        </w:tblPrEx>
         <w:tc>
           <w:tcPr>
             <w:tcW w:w="2200" w:type="dxa"/>
@@ -2176,12 +1651,6 @@
         </w:tc>
       </w:tr>
       <w:tr>
-        <w:tblPrEx>
-          <w:tblCellMar>
-            <w:top w:w="0" w:type="dxa"/>
-            <w:bottom w:w="0" w:type="dxa"/>
-          </w:tblCellMar>
-        </w:tblPrEx>
         <w:tc>
           <w:tcPr>
             <w:tcW w:w="2200" w:type="dxa"/>
@@ -2226,12 +1695,6 @@
         </w:tc>
       </w:tr>
       <w:tr>
-        <w:tblPrEx>
-          <w:tblCellMar>
-            <w:top w:w="0" w:type="dxa"/>
-            <w:bottom w:w="0" w:type="dxa"/>
-          </w:tblCellMar>
-        </w:tblPrEx>
         <w:tc>
           <w:tcPr>
             <w:tcW w:w="2200" w:type="dxa"/>
@@ -2276,12 +1739,6 @@
         </w:tc>
       </w:tr>
       <w:tr>
-        <w:tblPrEx>
-          <w:tblCellMar>
-            <w:top w:w="0" w:type="dxa"/>
-            <w:bottom w:w="0" w:type="dxa"/>
-          </w:tblCellMar>
-        </w:tblPrEx>
         <w:tc>
           <w:tcPr>
             <w:tcW w:w="2200" w:type="dxa"/>
@@ -2326,12 +1783,6 @@
         </w:tc>
       </w:tr>
       <w:tr>
-        <w:tblPrEx>
-          <w:tblCellMar>
-            <w:top w:w="0" w:type="dxa"/>
-            <w:bottom w:w="0" w:type="dxa"/>
-          </w:tblCellMar>
-        </w:tblPrEx>
         <w:tc>
           <w:tcPr>
             <w:tcW w:w="2200" w:type="dxa"/>
@@ -2376,12 +1827,6 @@
         </w:tc>
       </w:tr>
       <w:tr>
-        <w:tblPrEx>
-          <w:tblCellMar>
-            <w:top w:w="0" w:type="dxa"/>
-            <w:bottom w:w="0" w:type="dxa"/>
-          </w:tblCellMar>
-        </w:tblPrEx>
         <w:tc>
           <w:tcPr>
             <w:tcW w:w="2200" w:type="dxa"/>
@@ -2432,12 +1877,6 @@
         </w:tc>
       </w:tr>
       <w:tr>
-        <w:tblPrEx>
-          <w:tblCellMar>
-            <w:top w:w="0" w:type="dxa"/>
-            <w:bottom w:w="0" w:type="dxa"/>
-          </w:tblCellMar>
-        </w:tblPrEx>
         <w:tc>
           <w:tcPr>
             <w:tcW w:w="2200" w:type="dxa"/>
@@ -2482,12 +1921,6 @@
         </w:tc>
       </w:tr>
       <w:tr>
-        <w:tblPrEx>
-          <w:tblCellMar>
-            <w:top w:w="0" w:type="dxa"/>
-            <w:bottom w:w="0" w:type="dxa"/>
-          </w:tblCellMar>
-        </w:tblPrEx>
         <w:tc>
           <w:tcPr>
             <w:tcW w:w="2200" w:type="dxa"/>
@@ -2532,12 +1965,6 @@
         </w:tc>
       </w:tr>
       <w:tr>
-        <w:tblPrEx>
-          <w:tblCellMar>
-            <w:top w:w="0" w:type="dxa"/>
-            <w:bottom w:w="0" w:type="dxa"/>
-          </w:tblCellMar>
-        </w:tblPrEx>
         <w:tc>
           <w:tcPr>
             <w:tcW w:w="2200" w:type="dxa"/>
@@ -3030,12 +2457,6 @@
         <w:gridCol w:w="3200"/>
       </w:tblGrid>
       <w:tr>
-        <w:tblPrEx>
-          <w:tblCellMar>
-            <w:top w:w="0" w:type="dxa"/>
-            <w:bottom w:w="0" w:type="dxa"/>
-          </w:tblCellMar>
-        </w:tblPrEx>
         <w:trPr>
           <w:tblHeader/>
         </w:trPr>
@@ -3122,12 +2543,6 @@
         </w:tc>
       </w:tr>
       <w:tr>
-        <w:tblPrEx>
-          <w:tblCellMar>
-            <w:top w:w="0" w:type="dxa"/>
-            <w:bottom w:w="0" w:type="dxa"/>
-          </w:tblCellMar>
-        </w:tblPrEx>
         <w:tc>
           <w:tcPr>
             <w:tcW w:w="1600" w:type="dxa"/>
@@ -3230,12 +2645,6 @@
         </w:tc>
       </w:tr>
       <w:tr>
-        <w:tblPrEx>
-          <w:tblCellMar>
-            <w:top w:w="0" w:type="dxa"/>
-            <w:bottom w:w="0" w:type="dxa"/>
-          </w:tblCellMar>
-        </w:tblPrEx>
         <w:tc>
           <w:tcPr>
             <w:tcW w:w="1600" w:type="dxa"/>
@@ -3329,12 +2738,6 @@
         </w:tc>
       </w:tr>
       <w:tr>
-        <w:tblPrEx>
-          <w:tblCellMar>
-            <w:top w:w="0" w:type="dxa"/>
-            <w:bottom w:w="0" w:type="dxa"/>
-          </w:tblCellMar>
-        </w:tblPrEx>
         <w:tc>
           <w:tcPr>
             <w:tcW w:w="1600" w:type="dxa"/>
@@ -3428,12 +2831,6 @@
         </w:tc>
       </w:tr>
       <w:tr>
-        <w:tblPrEx>
-          <w:tblCellMar>
-            <w:top w:w="0" w:type="dxa"/>
-            <w:bottom w:w="0" w:type="dxa"/>
-          </w:tblCellMar>
-        </w:tblPrEx>
         <w:tc>
           <w:tcPr>
             <w:tcW w:w="1600" w:type="dxa"/>
@@ -3518,12 +2915,6 @@
         </w:tc>
       </w:tr>
       <w:tr>
-        <w:tblPrEx>
-          <w:tblCellMar>
-            <w:top w:w="0" w:type="dxa"/>
-            <w:bottom w:w="0" w:type="dxa"/>
-          </w:tblCellMar>
-        </w:tblPrEx>
         <w:tc>
           <w:tcPr>
             <w:tcW w:w="1600" w:type="dxa"/>
@@ -3650,12 +3041,6 @@
         <w:gridCol w:w="3000"/>
       </w:tblGrid>
       <w:tr>
-        <w:tblPrEx>
-          <w:tblCellMar>
-            <w:top w:w="0" w:type="dxa"/>
-            <w:bottom w:w="0" w:type="dxa"/>
-          </w:tblCellMar>
-        </w:tblPrEx>
         <w:trPr>
           <w:tblHeader/>
         </w:trPr>
@@ -3742,12 +3127,6 @@
         </w:tc>
       </w:tr>
       <w:tr>
-        <w:tblPrEx>
-          <w:tblCellMar>
-            <w:top w:w="0" w:type="dxa"/>
-            <w:bottom w:w="0" w:type="dxa"/>
-          </w:tblCellMar>
-        </w:tblPrEx>
         <w:tc>
           <w:tcPr>
             <w:tcW w:w="1000" w:type="dxa"/>
@@ -3813,12 +3192,6 @@
         </w:tc>
       </w:tr>
       <w:tr>
-        <w:tblPrEx>
-          <w:tblCellMar>
-            <w:top w:w="0" w:type="dxa"/>
-            <w:bottom w:w="0" w:type="dxa"/>
-          </w:tblCellMar>
-        </w:tblPrEx>
         <w:tc>
           <w:tcPr>
             <w:tcW w:w="1000" w:type="dxa"/>
@@ -3884,12 +3257,6 @@
         </w:tc>
       </w:tr>
       <w:tr>
-        <w:tblPrEx>
-          <w:tblCellMar>
-            <w:top w:w="0" w:type="dxa"/>
-            <w:bottom w:w="0" w:type="dxa"/>
-          </w:tblCellMar>
-        </w:tblPrEx>
         <w:tc>
           <w:tcPr>
             <w:tcW w:w="1000" w:type="dxa"/>
@@ -3955,12 +3322,6 @@
         </w:tc>
       </w:tr>
       <w:tr>
-        <w:tblPrEx>
-          <w:tblCellMar>
-            <w:top w:w="0" w:type="dxa"/>
-            <w:bottom w:w="0" w:type="dxa"/>
-          </w:tblCellMar>
-        </w:tblPrEx>
         <w:tc>
           <w:tcPr>
             <w:tcW w:w="1000" w:type="dxa"/>
@@ -4026,12 +3387,6 @@
         </w:tc>
       </w:tr>
       <w:tr>
-        <w:tblPrEx>
-          <w:tblCellMar>
-            <w:top w:w="0" w:type="dxa"/>
-            <w:bottom w:w="0" w:type="dxa"/>
-          </w:tblCellMar>
-        </w:tblPrEx>
         <w:tc>
           <w:tcPr>
             <w:tcW w:w="1000" w:type="dxa"/>
@@ -4097,12 +3452,6 @@
         </w:tc>
       </w:tr>
       <w:tr>
-        <w:tblPrEx>
-          <w:tblCellMar>
-            <w:top w:w="0" w:type="dxa"/>
-            <w:bottom w:w="0" w:type="dxa"/>
-          </w:tblCellMar>
-        </w:tblPrEx>
         <w:tc>
           <w:tcPr>
             <w:tcW w:w="1000" w:type="dxa"/>
@@ -4168,12 +3517,6 @@
         </w:tc>
       </w:tr>
       <w:tr>
-        <w:tblPrEx>
-          <w:tblCellMar>
-            <w:top w:w="0" w:type="dxa"/>
-            <w:bottom w:w="0" w:type="dxa"/>
-          </w:tblCellMar>
-        </w:tblPrEx>
         <w:tc>
           <w:tcPr>
             <w:tcW w:w="1000" w:type="dxa"/>
@@ -4239,12 +3582,6 @@
         </w:tc>
       </w:tr>
       <w:tr>
-        <w:tblPrEx>
-          <w:tblCellMar>
-            <w:top w:w="0" w:type="dxa"/>
-            <w:bottom w:w="0" w:type="dxa"/>
-          </w:tblCellMar>
-        </w:tblPrEx>
         <w:tc>
           <w:tcPr>
             <w:tcW w:w="1000" w:type="dxa"/>
@@ -4567,12 +3904,6 @@
         <w:gridCol w:w="3600"/>
       </w:tblGrid>
       <w:tr>
-        <w:tblPrEx>
-          <w:tblCellMar>
-            <w:top w:w="0" w:type="dxa"/>
-            <w:bottom w:w="0" w:type="dxa"/>
-          </w:tblCellMar>
-        </w:tblPrEx>
         <w:trPr>
           <w:tblHeader/>
         </w:trPr>
@@ -4659,12 +3990,6 @@
         </w:tc>
       </w:tr>
       <w:tr>
-        <w:tblPrEx>
-          <w:tblCellMar>
-            <w:top w:w="0" w:type="dxa"/>
-            <w:bottom w:w="0" w:type="dxa"/>
-          </w:tblCellMar>
-        </w:tblPrEx>
         <w:tc>
           <w:tcPr>
             <w:tcW w:w="2800" w:type="dxa"/>
@@ -4730,12 +4055,6 @@
         </w:tc>
       </w:tr>
       <w:tr>
-        <w:tblPrEx>
-          <w:tblCellMar>
-            <w:top w:w="0" w:type="dxa"/>
-            <w:bottom w:w="0" w:type="dxa"/>
-          </w:tblCellMar>
-        </w:tblPrEx>
         <w:tc>
           <w:tcPr>
             <w:tcW w:w="2800" w:type="dxa"/>
@@ -4801,12 +4120,6 @@
         </w:tc>
       </w:tr>
       <w:tr>
-        <w:tblPrEx>
-          <w:tblCellMar>
-            <w:top w:w="0" w:type="dxa"/>
-            <w:bottom w:w="0" w:type="dxa"/>
-          </w:tblCellMar>
-        </w:tblPrEx>
         <w:tc>
           <w:tcPr>
             <w:tcW w:w="2800" w:type="dxa"/>
@@ -4872,12 +4185,6 @@
         </w:tc>
       </w:tr>
       <w:tr>
-        <w:tblPrEx>
-          <w:tblCellMar>
-            <w:top w:w="0" w:type="dxa"/>
-            <w:bottom w:w="0" w:type="dxa"/>
-          </w:tblCellMar>
-        </w:tblPrEx>
         <w:tc>
           <w:tcPr>
             <w:tcW w:w="2800" w:type="dxa"/>
@@ -4984,12 +4291,6 @@
         <w:gridCol w:w="3200"/>
       </w:tblGrid>
       <w:tr>
-        <w:tblPrEx>
-          <w:tblCellMar>
-            <w:top w:w="0" w:type="dxa"/>
-            <w:bottom w:w="0" w:type="dxa"/>
-          </w:tblCellMar>
-        </w:tblPrEx>
         <w:trPr>
           <w:tblHeader/>
         </w:trPr>
@@ -5076,12 +4377,6 @@
         </w:tc>
       </w:tr>
       <w:tr>
-        <w:tblPrEx>
-          <w:tblCellMar>
-            <w:top w:w="0" w:type="dxa"/>
-            <w:bottom w:w="0" w:type="dxa"/>
-          </w:tblCellMar>
-        </w:tblPrEx>
         <w:tc>
           <w:tcPr>
             <w:tcW w:w="2400" w:type="dxa"/>
@@ -5147,12 +4442,6 @@
         </w:tc>
       </w:tr>
       <w:tr>
-        <w:tblPrEx>
-          <w:tblCellMar>
-            <w:top w:w="0" w:type="dxa"/>
-            <w:bottom w:w="0" w:type="dxa"/>
-          </w:tblCellMar>
-        </w:tblPrEx>
         <w:tc>
           <w:tcPr>
             <w:tcW w:w="2400" w:type="dxa"/>
@@ -5218,12 +4507,6 @@
         </w:tc>
       </w:tr>
       <w:tr>
-        <w:tblPrEx>
-          <w:tblCellMar>
-            <w:top w:w="0" w:type="dxa"/>
-            <w:bottom w:w="0" w:type="dxa"/>
-          </w:tblCellMar>
-        </w:tblPrEx>
         <w:tc>
           <w:tcPr>
             <w:tcW w:w="2400" w:type="dxa"/>
@@ -5289,12 +4572,6 @@
         </w:tc>
       </w:tr>
       <w:tr>
-        <w:tblPrEx>
-          <w:tblCellMar>
-            <w:top w:w="0" w:type="dxa"/>
-            <w:bottom w:w="0" w:type="dxa"/>
-          </w:tblCellMar>
-        </w:tblPrEx>
         <w:tc>
           <w:tcPr>
             <w:tcW w:w="2400" w:type="dxa"/>
@@ -5434,12 +4711,6 @@
         <w:gridCol w:w="2200"/>
       </w:tblGrid>
       <w:tr>
-        <w:tblPrEx>
-          <w:tblCellMar>
-            <w:top w:w="0" w:type="dxa"/>
-            <w:bottom w:w="0" w:type="dxa"/>
-          </w:tblCellMar>
-        </w:tblPrEx>
         <w:trPr>
           <w:tblHeader/>
         </w:trPr>
@@ -5553,12 +4824,6 @@
         </w:tc>
       </w:tr>
       <w:tr>
-        <w:tblPrEx>
-          <w:tblCellMar>
-            <w:top w:w="0" w:type="dxa"/>
-            <w:bottom w:w="0" w:type="dxa"/>
-          </w:tblCellMar>
-        </w:tblPrEx>
         <w:tc>
           <w:tcPr>
             <w:tcW w:w="2600" w:type="dxa"/>
@@ -5645,12 +4910,6 @@
         </w:tc>
       </w:tr>
       <w:tr>
-        <w:tblPrEx>
-          <w:tblCellMar>
-            <w:top w:w="0" w:type="dxa"/>
-            <w:bottom w:w="0" w:type="dxa"/>
-          </w:tblCellMar>
-        </w:tblPrEx>
         <w:tc>
           <w:tcPr>
             <w:tcW w:w="2600" w:type="dxa"/>
@@ -5737,12 +4996,6 @@
         </w:tc>
       </w:tr>
       <w:tr>
-        <w:tblPrEx>
-          <w:tblCellMar>
-            <w:top w:w="0" w:type="dxa"/>
-            <w:bottom w:w="0" w:type="dxa"/>
-          </w:tblCellMar>
-        </w:tblPrEx>
         <w:tc>
           <w:tcPr>
             <w:tcW w:w="2600" w:type="dxa"/>
@@ -5829,12 +5082,6 @@
         </w:tc>
       </w:tr>
       <w:tr>
-        <w:tblPrEx>
-          <w:tblCellMar>
-            <w:top w:w="0" w:type="dxa"/>
-            <w:bottom w:w="0" w:type="dxa"/>
-          </w:tblCellMar>
-        </w:tblPrEx>
         <w:tc>
           <w:tcPr>
             <w:tcW w:w="2600" w:type="dxa"/>
@@ -5921,12 +5168,6 @@
         </w:tc>
       </w:tr>
       <w:tr>
-        <w:tblPrEx>
-          <w:tblCellMar>
-            <w:top w:w="0" w:type="dxa"/>
-            <w:bottom w:w="0" w:type="dxa"/>
-          </w:tblCellMar>
-        </w:tblPrEx>
         <w:tc>
           <w:tcPr>
             <w:tcW w:w="2600" w:type="dxa"/>
@@ -6013,12 +5254,6 @@
         </w:tc>
       </w:tr>
       <w:tr>
-        <w:tblPrEx>
-          <w:tblCellMar>
-            <w:top w:w="0" w:type="dxa"/>
-            <w:bottom w:w="0" w:type="dxa"/>
-          </w:tblCellMar>
-        </w:tblPrEx>
         <w:tc>
           <w:tcPr>
             <w:tcW w:w="2600" w:type="dxa"/>
@@ -6458,12 +5693,6 @@
         <w:gridCol w:w="5800"/>
       </w:tblGrid>
       <w:tr>
-        <w:tblPrEx>
-          <w:tblCellMar>
-            <w:top w:w="0" w:type="dxa"/>
-            <w:bottom w:w="0" w:type="dxa"/>
-          </w:tblCellMar>
-        </w:tblPrEx>
         <w:trPr>
           <w:tblHeader/>
         </w:trPr>
@@ -6550,12 +5779,6 @@
         </w:tc>
       </w:tr>
       <w:tr>
-        <w:tblPrEx>
-          <w:tblCellMar>
-            <w:top w:w="0" w:type="dxa"/>
-            <w:bottom w:w="0" w:type="dxa"/>
-          </w:tblCellMar>
-        </w:tblPrEx>
         <w:tc>
           <w:tcPr>
             <w:tcW w:w="1000" w:type="dxa"/>
@@ -6621,12 +5844,6 @@
         </w:tc>
       </w:tr>
       <w:tr>
-        <w:tblPrEx>
-          <w:tblCellMar>
-            <w:top w:w="0" w:type="dxa"/>
-            <w:bottom w:w="0" w:type="dxa"/>
-          </w:tblCellMar>
-        </w:tblPrEx>
         <w:tc>
           <w:tcPr>
             <w:tcW w:w="1000" w:type="dxa"/>
@@ -6692,12 +5909,6 @@
         </w:tc>
       </w:tr>
       <w:tr>
-        <w:tblPrEx>
-          <w:tblCellMar>
-            <w:top w:w="0" w:type="dxa"/>
-            <w:bottom w:w="0" w:type="dxa"/>
-          </w:tblCellMar>
-        </w:tblPrEx>
         <w:tc>
           <w:tcPr>
             <w:tcW w:w="1000" w:type="dxa"/>
@@ -6763,12 +5974,6 @@
         </w:tc>
       </w:tr>
       <w:tr>
-        <w:tblPrEx>
-          <w:tblCellMar>
-            <w:top w:w="0" w:type="dxa"/>
-            <w:bottom w:w="0" w:type="dxa"/>
-          </w:tblCellMar>
-        </w:tblPrEx>
         <w:tc>
           <w:tcPr>
             <w:tcW w:w="1000" w:type="dxa"/>
@@ -6834,12 +6039,6 @@
         </w:tc>
       </w:tr>
       <w:tr>
-        <w:tblPrEx>
-          <w:tblCellMar>
-            <w:top w:w="0" w:type="dxa"/>
-            <w:bottom w:w="0" w:type="dxa"/>
-          </w:tblCellMar>
-        </w:tblPrEx>
         <w:tc>
           <w:tcPr>
             <w:tcW w:w="1000" w:type="dxa"/>
@@ -6905,12 +6104,6 @@
         </w:tc>
       </w:tr>
       <w:tr>
-        <w:tblPrEx>
-          <w:tblCellMar>
-            <w:top w:w="0" w:type="dxa"/>
-            <w:bottom w:w="0" w:type="dxa"/>
-          </w:tblCellMar>
-        </w:tblPrEx>
         <w:tc>
           <w:tcPr>
             <w:tcW w:w="1000" w:type="dxa"/>
@@ -6976,12 +6169,6 @@
         </w:tc>
       </w:tr>
       <w:tr>
-        <w:tblPrEx>
-          <w:tblCellMar>
-            <w:top w:w="0" w:type="dxa"/>
-            <w:bottom w:w="0" w:type="dxa"/>
-          </w:tblCellMar>
-        </w:tblPrEx>
         <w:tc>
           <w:tcPr>
             <w:tcW w:w="1000" w:type="dxa"/>
@@ -7047,12 +6234,6 @@
         </w:tc>
       </w:tr>
       <w:tr>
-        <w:tblPrEx>
-          <w:tblCellMar>
-            <w:top w:w="0" w:type="dxa"/>
-            <w:bottom w:w="0" w:type="dxa"/>
-          </w:tblCellMar>
-        </w:tblPrEx>
         <w:tc>
           <w:tcPr>
             <w:tcW w:w="1000" w:type="dxa"/>
@@ -7118,12 +6299,6 @@
         </w:tc>
       </w:tr>
       <w:tr>
-        <w:tblPrEx>
-          <w:tblCellMar>
-            <w:top w:w="0" w:type="dxa"/>
-            <w:bottom w:w="0" w:type="dxa"/>
-          </w:tblCellMar>
-        </w:tblPrEx>
         <w:tc>
           <w:tcPr>
             <w:tcW w:w="1000" w:type="dxa"/>
@@ -7189,12 +6364,6 @@
         </w:tc>
       </w:tr>
       <w:tr>
-        <w:tblPrEx>
-          <w:tblCellMar>
-            <w:top w:w="0" w:type="dxa"/>
-            <w:bottom w:w="0" w:type="dxa"/>
-          </w:tblCellMar>
-        </w:tblPrEx>
         <w:tc>
           <w:tcPr>
             <w:tcW w:w="1000" w:type="dxa"/>
@@ -7298,12 +6467,6 @@
         <w:gridCol w:w="5600"/>
       </w:tblGrid>
       <w:tr>
-        <w:tblPrEx>
-          <w:tblCellMar>
-            <w:top w:w="0" w:type="dxa"/>
-            <w:bottom w:w="0" w:type="dxa"/>
-          </w:tblCellMar>
-        </w:tblPrEx>
         <w:trPr>
           <w:tblHeader/>
         </w:trPr>
@@ -7390,12 +6553,6 @@
         </w:tc>
       </w:tr>
       <w:tr>
-        <w:tblPrEx>
-          <w:tblCellMar>
-            <w:top w:w="0" w:type="dxa"/>
-            <w:bottom w:w="0" w:type="dxa"/>
-          </w:tblCellMar>
-        </w:tblPrEx>
         <w:tc>
           <w:tcPr>
             <w:tcW w:w="1000" w:type="dxa"/>
@@ -7461,12 +6618,6 @@
         </w:tc>
       </w:tr>
       <w:tr>
-        <w:tblPrEx>
-          <w:tblCellMar>
-            <w:top w:w="0" w:type="dxa"/>
-            <w:bottom w:w="0" w:type="dxa"/>
-          </w:tblCellMar>
-        </w:tblPrEx>
         <w:tc>
           <w:tcPr>
             <w:tcW w:w="1000" w:type="dxa"/>
@@ -7533,12 +6684,6 @@
         </w:tc>
       </w:tr>
       <w:tr>
-        <w:tblPrEx>
-          <w:tblCellMar>
-            <w:top w:w="0" w:type="dxa"/>
-            <w:bottom w:w="0" w:type="dxa"/>
-          </w:tblCellMar>
-        </w:tblPrEx>
         <w:tc>
           <w:tcPr>
             <w:tcW w:w="1000" w:type="dxa"/>
@@ -7604,12 +6749,6 @@
         </w:tc>
       </w:tr>
       <w:tr>
-        <w:tblPrEx>
-          <w:tblCellMar>
-            <w:top w:w="0" w:type="dxa"/>
-            <w:bottom w:w="0" w:type="dxa"/>
-          </w:tblCellMar>
-        </w:tblPrEx>
         <w:tc>
           <w:tcPr>
             <w:tcW w:w="1000" w:type="dxa"/>
@@ -7675,12 +6814,6 @@
         </w:tc>
       </w:tr>
       <w:tr>
-        <w:tblPrEx>
-          <w:tblCellMar>
-            <w:top w:w="0" w:type="dxa"/>
-            <w:bottom w:w="0" w:type="dxa"/>
-          </w:tblCellMar>
-        </w:tblPrEx>
         <w:tc>
           <w:tcPr>
             <w:tcW w:w="1000" w:type="dxa"/>
@@ -7746,12 +6879,6 @@
         </w:tc>
       </w:tr>
       <w:tr>
-        <w:tblPrEx>
-          <w:tblCellMar>
-            <w:top w:w="0" w:type="dxa"/>
-            <w:bottom w:w="0" w:type="dxa"/>
-          </w:tblCellMar>
-        </w:tblPrEx>
         <w:tc>
           <w:tcPr>
             <w:tcW w:w="1000" w:type="dxa"/>
@@ -7854,12 +6981,6 @@
         <w:gridCol w:w="7800"/>
       </w:tblGrid>
       <w:tr>
-        <w:tblPrEx>
-          <w:tblCellMar>
-            <w:top w:w="0" w:type="dxa"/>
-            <w:bottom w:w="0" w:type="dxa"/>
-          </w:tblCellMar>
-        </w:tblPrEx>
         <w:trPr>
           <w:tblHeader/>
         </w:trPr>
@@ -7919,12 +7040,6 @@
         </w:tc>
       </w:tr>
       <w:tr>
-        <w:tblPrEx>
-          <w:tblCellMar>
-            <w:top w:w="0" w:type="dxa"/>
-            <w:bottom w:w="0" w:type="dxa"/>
-          </w:tblCellMar>
-        </w:tblPrEx>
         <w:tc>
           <w:tcPr>
             <w:tcW w:w="1200" w:type="dxa"/>
@@ -7969,12 +7084,6 @@
         </w:tc>
       </w:tr>
       <w:tr>
-        <w:tblPrEx>
-          <w:tblCellMar>
-            <w:top w:w="0" w:type="dxa"/>
-            <w:bottom w:w="0" w:type="dxa"/>
-          </w:tblCellMar>
-        </w:tblPrEx>
         <w:tc>
           <w:tcPr>
             <w:tcW w:w="1200" w:type="dxa"/>
@@ -8019,12 +7128,6 @@
         </w:tc>
       </w:tr>
       <w:tr>
-        <w:tblPrEx>
-          <w:tblCellMar>
-            <w:top w:w="0" w:type="dxa"/>
-            <w:bottom w:w="0" w:type="dxa"/>
-          </w:tblCellMar>
-        </w:tblPrEx>
         <w:tc>
           <w:tcPr>
             <w:tcW w:w="1200" w:type="dxa"/>
@@ -8069,12 +7172,6 @@
         </w:tc>
       </w:tr>
       <w:tr>
-        <w:tblPrEx>
-          <w:tblCellMar>
-            <w:top w:w="0" w:type="dxa"/>
-            <w:bottom w:w="0" w:type="dxa"/>
-          </w:tblCellMar>
-        </w:tblPrEx>
         <w:tc>
           <w:tcPr>
             <w:tcW w:w="1200" w:type="dxa"/>
@@ -8119,12 +7216,6 @@
         </w:tc>
       </w:tr>
       <w:tr>
-        <w:tblPrEx>
-          <w:tblCellMar>
-            <w:top w:w="0" w:type="dxa"/>
-            <w:bottom w:w="0" w:type="dxa"/>
-          </w:tblCellMar>
-        </w:tblPrEx>
         <w:tc>
           <w:tcPr>
             <w:tcW w:w="1200" w:type="dxa"/>
@@ -8169,12 +7260,6 @@
         </w:tc>
       </w:tr>
       <w:tr>
-        <w:tblPrEx>
-          <w:tblCellMar>
-            <w:top w:w="0" w:type="dxa"/>
-            <w:bottom w:w="0" w:type="dxa"/>
-          </w:tblCellMar>
-        </w:tblPrEx>
         <w:tc>
           <w:tcPr>
             <w:tcW w:w="1200" w:type="dxa"/>
@@ -8282,12 +7367,6 @@
         <w:gridCol w:w="4600"/>
       </w:tblGrid>
       <w:tr>
-        <w:tblPrEx>
-          <w:tblCellMar>
-            <w:top w:w="0" w:type="dxa"/>
-            <w:bottom w:w="0" w:type="dxa"/>
-          </w:tblCellMar>
-        </w:tblPrEx>
         <w:trPr>
           <w:tblHeader/>
         </w:trPr>
@@ -8374,12 +7453,6 @@
         </w:tc>
       </w:tr>
       <w:tr>
-        <w:tblPrEx>
-          <w:tblCellMar>
-            <w:top w:w="0" w:type="dxa"/>
-            <w:bottom w:w="0" w:type="dxa"/>
-          </w:tblCellMar>
-        </w:tblPrEx>
         <w:tc>
           <w:tcPr>
             <w:tcW w:w="1600" w:type="dxa"/>
@@ -8445,12 +7518,6 @@
         </w:tc>
       </w:tr>
       <w:tr>
-        <w:tblPrEx>
-          <w:tblCellMar>
-            <w:top w:w="0" w:type="dxa"/>
-            <w:bottom w:w="0" w:type="dxa"/>
-          </w:tblCellMar>
-        </w:tblPrEx>
         <w:tc>
           <w:tcPr>
             <w:tcW w:w="1600" w:type="dxa"/>
@@ -8516,12 +7583,6 @@
         </w:tc>
       </w:tr>
       <w:tr>
-        <w:tblPrEx>
-          <w:tblCellMar>
-            <w:top w:w="0" w:type="dxa"/>
-            <w:bottom w:w="0" w:type="dxa"/>
-          </w:tblCellMar>
-        </w:tblPrEx>
         <w:tc>
           <w:tcPr>
             <w:tcW w:w="1600" w:type="dxa"/>
@@ -8587,12 +7648,6 @@
         </w:tc>
       </w:tr>
       <w:tr>
-        <w:tblPrEx>
-          <w:tblCellMar>
-            <w:top w:w="0" w:type="dxa"/>
-            <w:bottom w:w="0" w:type="dxa"/>
-          </w:tblCellMar>
-        </w:tblPrEx>
         <w:tc>
           <w:tcPr>
             <w:tcW w:w="1600" w:type="dxa"/>
@@ -8659,12 +7714,6 @@
         </w:tc>
       </w:tr>
       <w:tr>
-        <w:tblPrEx>
-          <w:tblCellMar>
-            <w:top w:w="0" w:type="dxa"/>
-            <w:bottom w:w="0" w:type="dxa"/>
-          </w:tblCellMar>
-        </w:tblPrEx>
         <w:tc>
           <w:tcPr>
             <w:tcW w:w="1600" w:type="dxa"/>
@@ -8730,12 +7779,6 @@
         </w:tc>
       </w:tr>
       <w:tr>
-        <w:tblPrEx>
-          <w:tblCellMar>
-            <w:top w:w="0" w:type="dxa"/>
-            <w:bottom w:w="0" w:type="dxa"/>
-          </w:tblCellMar>
-        </w:tblPrEx>
         <w:tc>
           <w:tcPr>
             <w:tcW w:w="1600" w:type="dxa"/>
@@ -8801,12 +7844,6 @@
         </w:tc>
       </w:tr>
       <w:tr>
-        <w:tblPrEx>
-          <w:tblCellMar>
-            <w:top w:w="0" w:type="dxa"/>
-            <w:bottom w:w="0" w:type="dxa"/>
-          </w:tblCellMar>
-        </w:tblPrEx>
         <w:tc>
           <w:tcPr>
             <w:tcW w:w="1600" w:type="dxa"/>
@@ -8878,12 +7915,6 @@
         </w:tc>
       </w:tr>
       <w:tr>
-        <w:tblPrEx>
-          <w:tblCellMar>
-            <w:top w:w="0" w:type="dxa"/>
-            <w:bottom w:w="0" w:type="dxa"/>
-          </w:tblCellMar>
-        </w:tblPrEx>
         <w:tc>
           <w:tcPr>
             <w:tcW w:w="1600" w:type="dxa"/>
@@ -8949,12 +7980,6 @@
         </w:tc>
       </w:tr>
       <w:tr>
-        <w:tblPrEx>
-          <w:tblCellMar>
-            <w:top w:w="0" w:type="dxa"/>
-            <w:bottom w:w="0" w:type="dxa"/>
-          </w:tblCellMar>
-        </w:tblPrEx>
         <w:tc>
           <w:tcPr>
             <w:tcW w:w="1600" w:type="dxa"/>
@@ -9020,12 +8045,6 @@
         </w:tc>
       </w:tr>
       <w:tr>
-        <w:tblPrEx>
-          <w:tblCellMar>
-            <w:top w:w="0" w:type="dxa"/>
-            <w:bottom w:w="0" w:type="dxa"/>
-          </w:tblCellMar>
-        </w:tblPrEx>
         <w:tc>
           <w:tcPr>
             <w:tcW w:w="1600" w:type="dxa"/>
@@ -9103,12 +8122,6 @@
         </w:tc>
       </w:tr>
       <w:tr>
-        <w:tblPrEx>
-          <w:tblCellMar>
-            <w:top w:w="0" w:type="dxa"/>
-            <w:bottom w:w="0" w:type="dxa"/>
-          </w:tblCellMar>
-        </w:tblPrEx>
         <w:tc>
           <w:tcPr>
             <w:tcW w:w="1600" w:type="dxa"/>
@@ -9730,12 +8743,6 @@
         <w:gridCol w:w="3200"/>
       </w:tblGrid>
       <w:tr>
-        <w:tblPrEx>
-          <w:tblCellMar>
-            <w:top w:w="0" w:type="dxa"/>
-            <w:bottom w:w="0" w:type="dxa"/>
-          </w:tblCellMar>
-        </w:tblPrEx>
         <w:trPr>
           <w:tblHeader/>
         </w:trPr>
@@ -9822,12 +8829,6 @@
         </w:tc>
       </w:tr>
       <w:tr>
-        <w:tblPrEx>
-          <w:tblCellMar>
-            <w:top w:w="0" w:type="dxa"/>
-            <w:bottom w:w="0" w:type="dxa"/>
-          </w:tblCellMar>
-        </w:tblPrEx>
         <w:tc>
           <w:tcPr>
             <w:tcW w:w="1600" w:type="dxa"/>
@@ -9893,12 +8894,6 @@
         </w:tc>
       </w:tr>
       <w:tr>
-        <w:tblPrEx>
-          <w:tblCellMar>
-            <w:top w:w="0" w:type="dxa"/>
-            <w:bottom w:w="0" w:type="dxa"/>
-          </w:tblCellMar>
-        </w:tblPrEx>
         <w:tc>
           <w:tcPr>
             <w:tcW w:w="1600" w:type="dxa"/>
@@ -9964,12 +8959,6 @@
         </w:tc>
       </w:tr>
       <w:tr>
-        <w:tblPrEx>
-          <w:tblCellMar>
-            <w:top w:w="0" w:type="dxa"/>
-            <w:bottom w:w="0" w:type="dxa"/>
-          </w:tblCellMar>
-        </w:tblPrEx>
         <w:tc>
           <w:tcPr>
             <w:tcW w:w="1600" w:type="dxa"/>
@@ -10035,12 +9024,6 @@
         </w:tc>
       </w:tr>
       <w:tr>
-        <w:tblPrEx>
-          <w:tblCellMar>
-            <w:top w:w="0" w:type="dxa"/>
-            <w:bottom w:w="0" w:type="dxa"/>
-          </w:tblCellMar>
-        </w:tblPrEx>
         <w:tc>
           <w:tcPr>
             <w:tcW w:w="1600" w:type="dxa"/>
@@ -10106,12 +9089,6 @@
         </w:tc>
       </w:tr>
       <w:tr>
-        <w:tblPrEx>
-          <w:tblCellMar>
-            <w:top w:w="0" w:type="dxa"/>
-            <w:bottom w:w="0" w:type="dxa"/>
-          </w:tblCellMar>
-        </w:tblPrEx>
         <w:tc>
           <w:tcPr>
             <w:tcW w:w="1600" w:type="dxa"/>
@@ -10177,12 +9154,6 @@
         </w:tc>
       </w:tr>
       <w:tr>
-        <w:tblPrEx>
-          <w:tblCellMar>
-            <w:top w:w="0" w:type="dxa"/>
-            <w:bottom w:w="0" w:type="dxa"/>
-          </w:tblCellMar>
-        </w:tblPrEx>
         <w:tc>
           <w:tcPr>
             <w:tcW w:w="1600" w:type="dxa"/>
@@ -10248,12 +9219,6 @@
         </w:tc>
       </w:tr>
       <w:tr>
-        <w:tblPrEx>
-          <w:tblCellMar>
-            <w:top w:w="0" w:type="dxa"/>
-            <w:bottom w:w="0" w:type="dxa"/>
-          </w:tblCellMar>
-        </w:tblPrEx>
         <w:tc>
           <w:tcPr>
             <w:tcW w:w="1600" w:type="dxa"/>
@@ -10419,12 +9384,6 @@
         <w:gridCol w:w="3200"/>
       </w:tblGrid>
       <w:tr>
-        <w:tblPrEx>
-          <w:tblCellMar>
-            <w:top w:w="0" w:type="dxa"/>
-            <w:bottom w:w="0" w:type="dxa"/>
-          </w:tblCellMar>
-        </w:tblPrEx>
         <w:trPr>
           <w:tblHeader/>
         </w:trPr>
@@ -10511,12 +9470,6 @@
         </w:tc>
       </w:tr>
       <w:tr>
-        <w:tblPrEx>
-          <w:tblCellMar>
-            <w:top w:w="0" w:type="dxa"/>
-            <w:bottom w:w="0" w:type="dxa"/>
-          </w:tblCellMar>
-        </w:tblPrEx>
         <w:tc>
           <w:tcPr>
             <w:tcW w:w="2000" w:type="dxa"/>
@@ -10582,12 +9535,6 @@
         </w:tc>
       </w:tr>
       <w:tr>
-        <w:tblPrEx>
-          <w:tblCellMar>
-            <w:top w:w="0" w:type="dxa"/>
-            <w:bottom w:w="0" w:type="dxa"/>
-          </w:tblCellMar>
-        </w:tblPrEx>
         <w:tc>
           <w:tcPr>
             <w:tcW w:w="2000" w:type="dxa"/>
@@ -10653,12 +9600,6 @@
         </w:tc>
       </w:tr>
       <w:tr>
-        <w:tblPrEx>
-          <w:tblCellMar>
-            <w:top w:w="0" w:type="dxa"/>
-            <w:bottom w:w="0" w:type="dxa"/>
-          </w:tblCellMar>
-        </w:tblPrEx>
         <w:tc>
           <w:tcPr>
             <w:tcW w:w="2000" w:type="dxa"/>
@@ -10756,12 +9697,6 @@
         <w:gridCol w:w="3400"/>
       </w:tblGrid>
       <w:tr>
-        <w:tblPrEx>
-          <w:tblCellMar>
-            <w:top w:w="0" w:type="dxa"/>
-            <w:bottom w:w="0" w:type="dxa"/>
-          </w:tblCellMar>
-        </w:tblPrEx>
         <w:trPr>
           <w:tblHeader/>
         </w:trPr>
@@ -10848,12 +9783,6 @@
         </w:tc>
       </w:tr>
       <w:tr>
-        <w:tblPrEx>
-          <w:tblCellMar>
-            <w:top w:w="0" w:type="dxa"/>
-            <w:bottom w:w="0" w:type="dxa"/>
-          </w:tblCellMar>
-        </w:tblPrEx>
         <w:tc>
           <w:tcPr>
             <w:tcW w:w="1800" w:type="dxa"/>
@@ -10919,12 +9848,6 @@
         </w:tc>
       </w:tr>
       <w:tr>
-        <w:tblPrEx>
-          <w:tblCellMar>
-            <w:top w:w="0" w:type="dxa"/>
-            <w:bottom w:w="0" w:type="dxa"/>
-          </w:tblCellMar>
-        </w:tblPrEx>
         <w:tc>
           <w:tcPr>
             <w:tcW w:w="1800" w:type="dxa"/>
@@ -10990,12 +9913,6 @@
         </w:tc>
       </w:tr>
       <w:tr>
-        <w:tblPrEx>
-          <w:tblCellMar>
-            <w:top w:w="0" w:type="dxa"/>
-            <w:bottom w:w="0" w:type="dxa"/>
-          </w:tblCellMar>
-        </w:tblPrEx>
         <w:tc>
           <w:tcPr>
             <w:tcW w:w="1800" w:type="dxa"/>
@@ -11061,12 +9978,6 @@
         </w:tc>
       </w:tr>
       <w:tr>
-        <w:tblPrEx>
-          <w:tblCellMar>
-            <w:top w:w="0" w:type="dxa"/>
-            <w:bottom w:w="0" w:type="dxa"/>
-          </w:tblCellMar>
-        </w:tblPrEx>
         <w:tc>
           <w:tcPr>
             <w:tcW w:w="1800" w:type="dxa"/>
@@ -11133,12 +10044,6 @@
         </w:tc>
       </w:tr>
       <w:tr>
-        <w:tblPrEx>
-          <w:tblCellMar>
-            <w:top w:w="0" w:type="dxa"/>
-            <w:bottom w:w="0" w:type="dxa"/>
-          </w:tblCellMar>
-        </w:tblPrEx>
         <w:tc>
           <w:tcPr>
             <w:tcW w:w="1800" w:type="dxa"/>
@@ -11204,12 +10109,6 @@
         </w:tc>
       </w:tr>
       <w:tr>
-        <w:tblPrEx>
-          <w:tblCellMar>
-            <w:top w:w="0" w:type="dxa"/>
-            <w:bottom w:w="0" w:type="dxa"/>
-          </w:tblCellMar>
-        </w:tblPrEx>
         <w:tc>
           <w:tcPr>
             <w:tcW w:w="1800" w:type="dxa"/>
@@ -11276,12 +10175,6 @@
         </w:tc>
       </w:tr>
       <w:tr>
-        <w:tblPrEx>
-          <w:tblCellMar>
-            <w:top w:w="0" w:type="dxa"/>
-            <w:bottom w:w="0" w:type="dxa"/>
-          </w:tblCellMar>
-        </w:tblPrEx>
         <w:tc>
           <w:tcPr>
             <w:tcW w:w="1800" w:type="dxa"/>
@@ -11385,12 +10278,6 @@
         <w:gridCol w:w="3200"/>
       </w:tblGrid>
       <w:tr>
-        <w:tblPrEx>
-          <w:tblCellMar>
-            <w:top w:w="0" w:type="dxa"/>
-            <w:bottom w:w="0" w:type="dxa"/>
-          </w:tblCellMar>
-        </w:tblPrEx>
         <w:trPr>
           <w:tblHeader/>
         </w:trPr>
@@ -11477,12 +10364,6 @@
         </w:tc>
       </w:tr>
       <w:tr>
-        <w:tblPrEx>
-          <w:tblCellMar>
-            <w:top w:w="0" w:type="dxa"/>
-            <w:bottom w:w="0" w:type="dxa"/>
-          </w:tblCellMar>
-        </w:tblPrEx>
         <w:tc>
           <w:tcPr>
             <w:tcW w:w="2000" w:type="dxa"/>
@@ -11548,12 +10429,6 @@
         </w:tc>
       </w:tr>
       <w:tr>
-        <w:tblPrEx>
-          <w:tblCellMar>
-            <w:top w:w="0" w:type="dxa"/>
-            <w:bottom w:w="0" w:type="dxa"/>
-          </w:tblCellMar>
-        </w:tblPrEx>
         <w:tc>
           <w:tcPr>
             <w:tcW w:w="2000" w:type="dxa"/>
@@ -11619,12 +10494,6 @@
         </w:tc>
       </w:tr>
       <w:tr>
-        <w:tblPrEx>
-          <w:tblCellMar>
-            <w:top w:w="0" w:type="dxa"/>
-            <w:bottom w:w="0" w:type="dxa"/>
-          </w:tblCellMar>
-        </w:tblPrEx>
         <w:tc>
           <w:tcPr>
             <w:tcW w:w="2000" w:type="dxa"/>
@@ -11690,12 +10559,6 @@
         </w:tc>
       </w:tr>
       <w:tr>
-        <w:tblPrEx>
-          <w:tblCellMar>
-            <w:top w:w="0" w:type="dxa"/>
-            <w:bottom w:w="0" w:type="dxa"/>
-          </w:tblCellMar>
-        </w:tblPrEx>
         <w:tc>
           <w:tcPr>
             <w:tcW w:w="2000" w:type="dxa"/>
@@ -11886,12 +10749,6 @@
         <w:gridCol w:w="6000"/>
       </w:tblGrid>
       <w:tr>
-        <w:tblPrEx>
-          <w:tblCellMar>
-            <w:top w:w="0" w:type="dxa"/>
-            <w:bottom w:w="0" w:type="dxa"/>
-          </w:tblCellMar>
-        </w:tblPrEx>
         <w:trPr>
           <w:tblHeader/>
         </w:trPr>
@@ -11951,12 +10808,6 @@
         </w:tc>
       </w:tr>
       <w:tr>
-        <w:tblPrEx>
-          <w:tblCellMar>
-            <w:top w:w="0" w:type="dxa"/>
-            <w:bottom w:w="0" w:type="dxa"/>
-          </w:tblCellMar>
-        </w:tblPrEx>
         <w:tc>
           <w:tcPr>
             <w:tcW w:w="3000" w:type="dxa"/>
@@ -12001,12 +10852,6 @@
         </w:tc>
       </w:tr>
       <w:tr>
-        <w:tblPrEx>
-          <w:tblCellMar>
-            <w:top w:w="0" w:type="dxa"/>
-            <w:bottom w:w="0" w:type="dxa"/>
-          </w:tblCellMar>
-        </w:tblPrEx>
         <w:tc>
           <w:tcPr>
             <w:tcW w:w="3000" w:type="dxa"/>
@@ -12051,12 +10896,6 @@
         </w:tc>
       </w:tr>
       <w:tr>
-        <w:tblPrEx>
-          <w:tblCellMar>
-            <w:top w:w="0" w:type="dxa"/>
-            <w:bottom w:w="0" w:type="dxa"/>
-          </w:tblCellMar>
-        </w:tblPrEx>
         <w:tc>
           <w:tcPr>
             <w:tcW w:w="3000" w:type="dxa"/>
@@ -12101,12 +10940,6 @@
         </w:tc>
       </w:tr>
       <w:tr>
-        <w:tblPrEx>
-          <w:tblCellMar>
-            <w:top w:w="0" w:type="dxa"/>
-            <w:bottom w:w="0" w:type="dxa"/>
-          </w:tblCellMar>
-        </w:tblPrEx>
         <w:tc>
           <w:tcPr>
             <w:tcW w:w="3000" w:type="dxa"/>
@@ -12151,12 +10984,6 @@
         </w:tc>
       </w:tr>
       <w:tr>
-        <w:tblPrEx>
-          <w:tblCellMar>
-            <w:top w:w="0" w:type="dxa"/>
-            <w:bottom w:w="0" w:type="dxa"/>
-          </w:tblCellMar>
-        </w:tblPrEx>
         <w:tc>
           <w:tcPr>
             <w:tcW w:w="3000" w:type="dxa"/>
@@ -12201,12 +11028,6 @@
         </w:tc>
       </w:tr>
       <w:tr>
-        <w:tblPrEx>
-          <w:tblCellMar>
-            <w:top w:w="0" w:type="dxa"/>
-            <w:bottom w:w="0" w:type="dxa"/>
-          </w:tblCellMar>
-        </w:tblPrEx>
         <w:tc>
           <w:tcPr>
             <w:tcW w:w="3000" w:type="dxa"/>
@@ -12251,12 +11072,6 @@
         </w:tc>
       </w:tr>
       <w:tr>
-        <w:tblPrEx>
-          <w:tblCellMar>
-            <w:top w:w="0" w:type="dxa"/>
-            <w:bottom w:w="0" w:type="dxa"/>
-          </w:tblCellMar>
-        </w:tblPrEx>
         <w:tc>
           <w:tcPr>
             <w:tcW w:w="3000" w:type="dxa"/>
@@ -12332,12 +11147,6 @@
         <w:gridCol w:w="5600"/>
       </w:tblGrid>
       <w:tr>
-        <w:tblPrEx>
-          <w:tblCellMar>
-            <w:top w:w="0" w:type="dxa"/>
-            <w:bottom w:w="0" w:type="dxa"/>
-          </w:tblCellMar>
-        </w:tblPrEx>
         <w:trPr>
           <w:tblHeader/>
         </w:trPr>
@@ -12397,12 +11206,6 @@
         </w:tc>
       </w:tr>
       <w:tr>
-        <w:tblPrEx>
-          <w:tblCellMar>
-            <w:top w:w="0" w:type="dxa"/>
-            <w:bottom w:w="0" w:type="dxa"/>
-          </w:tblCellMar>
-        </w:tblPrEx>
         <w:tc>
           <w:tcPr>
             <w:tcW w:w="3400" w:type="dxa"/>
@@ -12447,12 +11250,6 @@
         </w:tc>
       </w:tr>
       <w:tr>
-        <w:tblPrEx>
-          <w:tblCellMar>
-            <w:top w:w="0" w:type="dxa"/>
-            <w:bottom w:w="0" w:type="dxa"/>
-          </w:tblCellMar>
-        </w:tblPrEx>
         <w:tc>
           <w:tcPr>
             <w:tcW w:w="3400" w:type="dxa"/>
@@ -12497,12 +11294,6 @@
         </w:tc>
       </w:tr>
       <w:tr>
-        <w:tblPrEx>
-          <w:tblCellMar>
-            <w:top w:w="0" w:type="dxa"/>
-            <w:bottom w:w="0" w:type="dxa"/>
-          </w:tblCellMar>
-        </w:tblPrEx>
         <w:tc>
           <w:tcPr>
             <w:tcW w:w="3400" w:type="dxa"/>
@@ -12547,12 +11338,6 @@
         </w:tc>
       </w:tr>
       <w:tr>
-        <w:tblPrEx>
-          <w:tblCellMar>
-            <w:top w:w="0" w:type="dxa"/>
-            <w:bottom w:w="0" w:type="dxa"/>
-          </w:tblCellMar>
-        </w:tblPrEx>
         <w:tc>
           <w:tcPr>
             <w:tcW w:w="3400" w:type="dxa"/>
@@ -12597,12 +11382,6 @@
         </w:tc>
       </w:tr>
       <w:tr>
-        <w:tblPrEx>
-          <w:tblCellMar>
-            <w:top w:w="0" w:type="dxa"/>
-            <w:bottom w:w="0" w:type="dxa"/>
-          </w:tblCellMar>
-        </w:tblPrEx>
         <w:tc>
           <w:tcPr>
             <w:tcW w:w="3400" w:type="dxa"/>
@@ -12647,12 +11426,6 @@
         </w:tc>
       </w:tr>
       <w:tr>
-        <w:tblPrEx>
-          <w:tblCellMar>
-            <w:top w:w="0" w:type="dxa"/>
-            <w:bottom w:w="0" w:type="dxa"/>
-          </w:tblCellMar>
-        </w:tblPrEx>
         <w:tc>
           <w:tcPr>
             <w:tcW w:w="3400" w:type="dxa"/>
@@ -12759,12 +11532,6 @@
         <w:gridCol w:w="3715"/>
       </w:tblGrid>
       <w:tr>
-        <w:tblPrEx>
-          <w:tblCellMar>
-            <w:top w:w="0" w:type="dxa"/>
-            <w:bottom w:w="0" w:type="dxa"/>
-          </w:tblCellMar>
-        </w:tblPrEx>
         <w:trPr>
           <w:tblHeader/>
         </w:trPr>
@@ -12878,12 +11645,6 @@
         </w:tc>
       </w:tr>
       <w:tr>
-        <w:tblPrEx>
-          <w:tblCellMar>
-            <w:top w:w="0" w:type="dxa"/>
-            <w:bottom w:w="0" w:type="dxa"/>
-          </w:tblCellMar>
-        </w:tblPrEx>
         <w:tc>
           <w:tcPr>
             <w:tcW w:w="1400" w:type="dxa"/>
@@ -12970,12 +11731,6 @@
         </w:tc>
       </w:tr>
       <w:tr>
-        <w:tblPrEx>
-          <w:tblCellMar>
-            <w:top w:w="0" w:type="dxa"/>
-            <w:bottom w:w="0" w:type="dxa"/>
-          </w:tblCellMar>
-        </w:tblPrEx>
         <w:tc>
           <w:tcPr>
             <w:tcW w:w="1400" w:type="dxa"/>
@@ -13062,12 +11817,6 @@
         </w:tc>
       </w:tr>
       <w:tr>
-        <w:tblPrEx>
-          <w:tblCellMar>
-            <w:top w:w="0" w:type="dxa"/>
-            <w:bottom w:w="0" w:type="dxa"/>
-          </w:tblCellMar>
-        </w:tblPrEx>
         <w:tc>
           <w:tcPr>
             <w:tcW w:w="1400" w:type="dxa"/>
@@ -13179,12 +11928,6 @@
         <w:gridCol w:w="2400"/>
       </w:tblGrid>
       <w:tr>
-        <w:tblPrEx>
-          <w:tblCellMar>
-            <w:top w:w="0" w:type="dxa"/>
-            <w:bottom w:w="0" w:type="dxa"/>
-          </w:tblCellMar>
-        </w:tblPrEx>
         <w:trPr>
           <w:tblHeader/>
         </w:trPr>
@@ -13298,12 +12041,6 @@
         </w:tc>
       </w:tr>
       <w:tr>
-        <w:tblPrEx>
-          <w:tblCellMar>
-            <w:top w:w="0" w:type="dxa"/>
-            <w:bottom w:w="0" w:type="dxa"/>
-          </w:tblCellMar>
-        </w:tblPrEx>
         <w:tc>
           <w:tcPr>
             <w:tcW w:w="800" w:type="dxa"/>
@@ -13400,12 +12137,6 @@
         </w:tc>
       </w:tr>
       <w:tr>
-        <w:tblPrEx>
-          <w:tblCellMar>
-            <w:top w:w="0" w:type="dxa"/>
-            <w:bottom w:w="0" w:type="dxa"/>
-          </w:tblCellMar>
-        </w:tblPrEx>
         <w:tc>
           <w:tcPr>
             <w:tcW w:w="800" w:type="dxa"/>
@@ -13502,12 +12233,6 @@
         </w:tc>
       </w:tr>
       <w:tr>
-        <w:tblPrEx>
-          <w:tblCellMar>
-            <w:top w:w="0" w:type="dxa"/>
-            <w:bottom w:w="0" w:type="dxa"/>
-          </w:tblCellMar>
-        </w:tblPrEx>
         <w:tc>
           <w:tcPr>
             <w:tcW w:w="800" w:type="dxa"/>
@@ -13604,12 +12329,6 @@
         </w:tc>
       </w:tr>
       <w:tr>
-        <w:tblPrEx>
-          <w:tblCellMar>
-            <w:top w:w="0" w:type="dxa"/>
-            <w:bottom w:w="0" w:type="dxa"/>
-          </w:tblCellMar>
-        </w:tblPrEx>
         <w:tc>
           <w:tcPr>
             <w:tcW w:w="800" w:type="dxa"/>
@@ -13706,12 +12425,6 @@
         </w:tc>
       </w:tr>
       <w:tr>
-        <w:tblPrEx>
-          <w:tblCellMar>
-            <w:top w:w="0" w:type="dxa"/>
-            <w:bottom w:w="0" w:type="dxa"/>
-          </w:tblCellMar>
-        </w:tblPrEx>
         <w:tc>
           <w:tcPr>
             <w:tcW w:w="800" w:type="dxa"/>
@@ -13808,12 +12521,6 @@
         </w:tc>
       </w:tr>
       <w:tr>
-        <w:tblPrEx>
-          <w:tblCellMar>
-            <w:top w:w="0" w:type="dxa"/>
-            <w:bottom w:w="0" w:type="dxa"/>
-          </w:tblCellMar>
-        </w:tblPrEx>
         <w:tc>
           <w:tcPr>
             <w:tcW w:w="800" w:type="dxa"/>
@@ -13910,12 +12617,6 @@
         </w:tc>
       </w:tr>
       <w:tr>
-        <w:tblPrEx>
-          <w:tblCellMar>
-            <w:top w:w="0" w:type="dxa"/>
-            <w:bottom w:w="0" w:type="dxa"/>
-          </w:tblCellMar>
-        </w:tblPrEx>
         <w:tc>
           <w:tcPr>
             <w:tcW w:w="800" w:type="dxa"/>
@@ -14012,12 +12713,6 @@
         </w:tc>
       </w:tr>
       <w:tr>
-        <w:tblPrEx>
-          <w:tblCellMar>
-            <w:top w:w="0" w:type="dxa"/>
-            <w:bottom w:w="0" w:type="dxa"/>
-          </w:tblCellMar>
-        </w:tblPrEx>
         <w:tc>
           <w:tcPr>
             <w:tcW w:w="800" w:type="dxa"/>
@@ -14114,12 +12809,6 @@
         </w:tc>
       </w:tr>
       <w:tr>
-        <w:tblPrEx>
-          <w:tblCellMar>
-            <w:top w:w="0" w:type="dxa"/>
-            <w:bottom w:w="0" w:type="dxa"/>
-          </w:tblCellMar>
-        </w:tblPrEx>
         <w:tc>
           <w:tcPr>
             <w:tcW w:w="800" w:type="dxa"/>
@@ -14216,12 +12905,6 @@
         </w:tc>
       </w:tr>
       <w:tr>
-        <w:tblPrEx>
-          <w:tblCellMar>
-            <w:top w:w="0" w:type="dxa"/>
-            <w:bottom w:w="0" w:type="dxa"/>
-          </w:tblCellMar>
-        </w:tblPrEx>
         <w:tc>
           <w:tcPr>
             <w:tcW w:w="800" w:type="dxa"/>
@@ -14310,12 +12993,6 @@
         </w:tc>
       </w:tr>
       <w:tr>
-        <w:tblPrEx>
-          <w:tblCellMar>
-            <w:top w:w="0" w:type="dxa"/>
-            <w:bottom w:w="0" w:type="dxa"/>
-          </w:tblCellMar>
-        </w:tblPrEx>
         <w:tc>
           <w:tcPr>
             <w:tcW w:w="800" w:type="dxa"/>
@@ -14404,12 +13081,6 @@
         </w:tc>
       </w:tr>
       <w:tr>
-        <w:tblPrEx>
-          <w:tblCellMar>
-            <w:top w:w="0" w:type="dxa"/>
-            <w:bottom w:w="0" w:type="dxa"/>
-          </w:tblCellMar>
-        </w:tblPrEx>
         <w:tc>
           <w:tcPr>
             <w:tcW w:w="800" w:type="dxa"/>
@@ -14498,12 +13169,6 @@
         </w:tc>
       </w:tr>
       <w:tr>
-        <w:tblPrEx>
-          <w:tblCellMar>
-            <w:top w:w="0" w:type="dxa"/>
-            <w:bottom w:w="0" w:type="dxa"/>
-          </w:tblCellMar>
-        </w:tblPrEx>
         <w:tc>
           <w:tcPr>
             <w:tcW w:w="800" w:type="dxa"/>
@@ -14592,12 +13257,6 @@
         </w:tc>
       </w:tr>
       <w:tr>
-        <w:tblPrEx>
-          <w:tblCellMar>
-            <w:top w:w="0" w:type="dxa"/>
-            <w:bottom w:w="0" w:type="dxa"/>
-          </w:tblCellMar>
-        </w:tblPrEx>
         <w:tc>
           <w:tcPr>
             <w:tcW w:w="800" w:type="dxa"/>
@@ -14686,12 +13345,6 @@
         </w:tc>
       </w:tr>
       <w:tr>
-        <w:tblPrEx>
-          <w:tblCellMar>
-            <w:top w:w="0" w:type="dxa"/>
-            <w:bottom w:w="0" w:type="dxa"/>
-          </w:tblCellMar>
-        </w:tblPrEx>
         <w:tc>
           <w:tcPr>
             <w:tcW w:w="800" w:type="dxa"/>
@@ -14780,12 +13433,6 @@
         </w:tc>
       </w:tr>
       <w:tr>
-        <w:tblPrEx>
-          <w:tblCellMar>
-            <w:top w:w="0" w:type="dxa"/>
-            <w:bottom w:w="0" w:type="dxa"/>
-          </w:tblCellMar>
-        </w:tblPrEx>
         <w:tc>
           <w:tcPr>
             <w:tcW w:w="800" w:type="dxa"/>
@@ -14880,12 +13527,6 @@
         </w:tc>
       </w:tr>
       <w:tr>
-        <w:tblPrEx>
-          <w:tblCellMar>
-            <w:top w:w="0" w:type="dxa"/>
-            <w:bottom w:w="0" w:type="dxa"/>
-          </w:tblCellMar>
-        </w:tblPrEx>
         <w:tc>
           <w:tcPr>
             <w:tcW w:w="800" w:type="dxa"/>
@@ -14974,12 +13615,6 @@
         </w:tc>
       </w:tr>
       <w:tr>
-        <w:tblPrEx>
-          <w:tblCellMar>
-            <w:top w:w="0" w:type="dxa"/>
-            <w:bottom w:w="0" w:type="dxa"/>
-          </w:tblCellMar>
-        </w:tblPrEx>
         <w:tc>
           <w:tcPr>
             <w:tcW w:w="800" w:type="dxa"/>
@@ -15068,12 +13703,6 @@
         </w:tc>
       </w:tr>
       <w:tr>
-        <w:tblPrEx>
-          <w:tblCellMar>
-            <w:top w:w="0" w:type="dxa"/>
-            <w:bottom w:w="0" w:type="dxa"/>
-          </w:tblCellMar>
-        </w:tblPrEx>
         <w:tc>
           <w:tcPr>
             <w:tcW w:w="800" w:type="dxa"/>
@@ -15162,12 +13791,6 @@
         </w:tc>
       </w:tr>
       <w:tr>
-        <w:tblPrEx>
-          <w:tblCellMar>
-            <w:top w:w="0" w:type="dxa"/>
-            <w:bottom w:w="0" w:type="dxa"/>
-          </w:tblCellMar>
-        </w:tblPrEx>
         <w:tc>
           <w:tcPr>
             <w:tcW w:w="800" w:type="dxa"/>
@@ -15256,12 +13879,6 @@
         </w:tc>
       </w:tr>
       <w:tr>
-        <w:tblPrEx>
-          <w:tblCellMar>
-            <w:top w:w="0" w:type="dxa"/>
-            <w:bottom w:w="0" w:type="dxa"/>
-          </w:tblCellMar>
-        </w:tblPrEx>
         <w:tc>
           <w:tcPr>
             <w:tcW w:w="800" w:type="dxa"/>
@@ -15399,12 +14016,6 @@
         <w:gridCol w:w="2335"/>
       </w:tblGrid>
       <w:tr>
-        <w:tblPrEx>
-          <w:tblCellMar>
-            <w:top w:w="0" w:type="dxa"/>
-            <w:bottom w:w="0" w:type="dxa"/>
-          </w:tblCellMar>
-        </w:tblPrEx>
         <w:trPr>
           <w:tblHeader/>
         </w:trPr>
@@ -15499,12 +14110,6 @@
         </w:tc>
       </w:tr>
       <w:tr>
-        <w:tblPrEx>
-          <w:tblCellMar>
-            <w:top w:w="0" w:type="dxa"/>
-            <w:bottom w:w="0" w:type="dxa"/>
-          </w:tblCellMar>
-        </w:tblPrEx>
         <w:tc>
           <w:tcPr>
             <w:tcW w:w="4600" w:type="dxa"/>
@@ -15589,12 +14194,6 @@
         </w:tc>
       </w:tr>
       <w:tr>
-        <w:tblPrEx>
-          <w:tblCellMar>
-            <w:top w:w="0" w:type="dxa"/>
-            <w:bottom w:w="0" w:type="dxa"/>
-          </w:tblCellMar>
-        </w:tblPrEx>
         <w:tc>
           <w:tcPr>
             <w:tcW w:w="4600" w:type="dxa"/>
@@ -15679,12 +14278,6 @@
         </w:tc>
       </w:tr>
       <w:tr>
-        <w:tblPrEx>
-          <w:tblCellMar>
-            <w:top w:w="0" w:type="dxa"/>
-            <w:bottom w:w="0" w:type="dxa"/>
-          </w:tblCellMar>
-        </w:tblPrEx>
         <w:tc>
           <w:tcPr>
             <w:tcW w:w="4600" w:type="dxa"/>
@@ -15751,12 +14344,6 @@
         </w:tc>
       </w:tr>
       <w:tr>
-        <w:tblPrEx>
-          <w:tblCellMar>
-            <w:top w:w="0" w:type="dxa"/>
-            <w:bottom w:w="0" w:type="dxa"/>
-          </w:tblCellMar>
-        </w:tblPrEx>
         <w:tc>
           <w:tcPr>
             <w:tcW w:w="4600" w:type="dxa"/>
@@ -15823,12 +14410,6 @@
         </w:tc>
       </w:tr>
       <w:tr>
-        <w:tblPrEx>
-          <w:tblCellMar>
-            <w:top w:w="0" w:type="dxa"/>
-            <w:bottom w:w="0" w:type="dxa"/>
-          </w:tblCellMar>
-        </w:tblPrEx>
         <w:tc>
           <w:tcPr>
             <w:tcW w:w="4600" w:type="dxa"/>
@@ -15895,12 +14476,6 @@
         </w:tc>
       </w:tr>
       <w:tr>
-        <w:tblPrEx>
-          <w:tblCellMar>
-            <w:top w:w="0" w:type="dxa"/>
-            <w:bottom w:w="0" w:type="dxa"/>
-          </w:tblCellMar>
-        </w:tblPrEx>
         <w:tc>
           <w:tcPr>
             <w:tcW w:w="4600" w:type="dxa"/>
@@ -15967,12 +14542,6 @@
         </w:tc>
       </w:tr>
       <w:tr>
-        <w:tblPrEx>
-          <w:tblCellMar>
-            <w:top w:w="0" w:type="dxa"/>
-            <w:bottom w:w="0" w:type="dxa"/>
-          </w:tblCellMar>
-        </w:tblPrEx>
         <w:tc>
           <w:tcPr>
             <w:tcW w:w="4600" w:type="dxa"/>
@@ -16045,12 +14614,6 @@
         </w:tc>
       </w:tr>
       <w:tr>
-        <w:tblPrEx>
-          <w:tblCellMar>
-            <w:top w:w="0" w:type="dxa"/>
-            <w:bottom w:w="0" w:type="dxa"/>
-          </w:tblCellMar>
-        </w:tblPrEx>
         <w:tc>
           <w:tcPr>
             <w:tcW w:w="4600" w:type="dxa"/>
@@ -16117,12 +14680,6 @@
         </w:tc>
       </w:tr>
       <w:tr>
-        <w:tblPrEx>
-          <w:tblCellMar>
-            <w:top w:w="0" w:type="dxa"/>
-            <w:bottom w:w="0" w:type="dxa"/>
-          </w:tblCellMar>
-        </w:tblPrEx>
         <w:tc>
           <w:tcPr>
             <w:tcW w:w="4600" w:type="dxa"/>
@@ -16184,12 +14741,6 @@
         </w:tc>
       </w:tr>
       <w:tr>
-        <w:tblPrEx>
-          <w:tblCellMar>
-            <w:top w:w="0" w:type="dxa"/>
-            <w:bottom w:w="0" w:type="dxa"/>
-          </w:tblCellMar>
-        </w:tblPrEx>
         <w:tc>
           <w:tcPr>
             <w:tcW w:w="4600" w:type="dxa"/>
@@ -16250,12 +14801,6 @@
         </w:tc>
       </w:tr>
       <w:tr>
-        <w:tblPrEx>
-          <w:tblCellMar>
-            <w:top w:w="0" w:type="dxa"/>
-            <w:bottom w:w="0" w:type="dxa"/>
-          </w:tblCellMar>
-        </w:tblPrEx>
         <w:tc>
           <w:tcPr>
             <w:tcW w:w="4600" w:type="dxa"/>
@@ -16633,12 +15178,6 @@
         <w:gridCol w:w="6400"/>
       </w:tblGrid>
       <w:tr>
-        <w:tblPrEx>
-          <w:tblCellMar>
-            <w:top w:w="0" w:type="dxa"/>
-            <w:bottom w:w="0" w:type="dxa"/>
-          </w:tblCellMar>
-        </w:tblPrEx>
         <w:trPr>
           <w:tblHeader/>
         </w:trPr>
@@ -16698,12 +15237,6 @@
         </w:tc>
       </w:tr>
       <w:tr>
-        <w:tblPrEx>
-          <w:tblCellMar>
-            <w:top w:w="0" w:type="dxa"/>
-            <w:bottom w:w="0" w:type="dxa"/>
-          </w:tblCellMar>
-        </w:tblPrEx>
         <w:tc>
           <w:tcPr>
             <w:tcW w:w="2600" w:type="dxa"/>
@@ -16748,12 +15281,6 @@
         </w:tc>
       </w:tr>
       <w:tr>
-        <w:tblPrEx>
-          <w:tblCellMar>
-            <w:top w:w="0" w:type="dxa"/>
-            <w:bottom w:w="0" w:type="dxa"/>
-          </w:tblCellMar>
-        </w:tblPrEx>
         <w:tc>
           <w:tcPr>
             <w:tcW w:w="2600" w:type="dxa"/>
@@ -16798,12 +15325,6 @@
         </w:tc>
       </w:tr>
       <w:tr>
-        <w:tblPrEx>
-          <w:tblCellMar>
-            <w:top w:w="0" w:type="dxa"/>
-            <w:bottom w:w="0" w:type="dxa"/>
-          </w:tblCellMar>
-        </w:tblPrEx>
         <w:tc>
           <w:tcPr>
             <w:tcW w:w="2600" w:type="dxa"/>
@@ -16848,12 +15369,6 @@
         </w:tc>
       </w:tr>
       <w:tr>
-        <w:tblPrEx>
-          <w:tblCellMar>
-            <w:top w:w="0" w:type="dxa"/>
-            <w:bottom w:w="0" w:type="dxa"/>
-          </w:tblCellMar>
-        </w:tblPrEx>
         <w:tc>
           <w:tcPr>
             <w:tcW w:w="2600" w:type="dxa"/>
@@ -16898,12 +15413,6 @@
         </w:tc>
       </w:tr>
       <w:tr>
-        <w:tblPrEx>
-          <w:tblCellMar>
-            <w:top w:w="0" w:type="dxa"/>
-            <w:bottom w:w="0" w:type="dxa"/>
-          </w:tblCellMar>
-        </w:tblPrEx>
         <w:tc>
           <w:tcPr>
             <w:tcW w:w="2600" w:type="dxa"/>
@@ -18128,12 +16637,6 @@
         <w:gridCol w:w="2900"/>
       </w:tblGrid>
       <w:tr>
-        <w:tblPrEx>
-          <w:tblCellMar>
-            <w:top w:w="0" w:type="dxa"/>
-            <w:bottom w:w="0" w:type="dxa"/>
-          </w:tblCellMar>
-        </w:tblPrEx>
         <w:trPr>
           <w:tblHeader/>
         </w:trPr>
@@ -18247,12 +16750,6 @@
         </w:tc>
       </w:tr>
       <w:tr>
-        <w:tblPrEx>
-          <w:tblCellMar>
-            <w:top w:w="0" w:type="dxa"/>
-            <w:bottom w:w="0" w:type="dxa"/>
-          </w:tblCellMar>
-        </w:tblPrEx>
         <w:tc>
           <w:tcPr>
             <w:tcW w:w="900" w:type="dxa"/>
@@ -18339,12 +16836,6 @@
         </w:tc>
       </w:tr>
       <w:tr>
-        <w:tblPrEx>
-          <w:tblCellMar>
-            <w:top w:w="0" w:type="dxa"/>
-            <w:bottom w:w="0" w:type="dxa"/>
-          </w:tblCellMar>
-        </w:tblPrEx>
         <w:tc>
           <w:tcPr>
             <w:tcW w:w="900" w:type="dxa"/>
@@ -18431,12 +16922,6 @@
         </w:tc>
       </w:tr>
       <w:tr>
-        <w:tblPrEx>
-          <w:tblCellMar>
-            <w:top w:w="0" w:type="dxa"/>
-            <w:bottom w:w="0" w:type="dxa"/>
-          </w:tblCellMar>
-        </w:tblPrEx>
         <w:tc>
           <w:tcPr>
             <w:tcW w:w="900" w:type="dxa"/>
@@ -18523,12 +17008,6 @@
         </w:tc>
       </w:tr>
       <w:tr>
-        <w:tblPrEx>
-          <w:tblCellMar>
-            <w:top w:w="0" w:type="dxa"/>
-            <w:bottom w:w="0" w:type="dxa"/>
-          </w:tblCellMar>
-        </w:tblPrEx>
         <w:tc>
           <w:tcPr>
             <w:tcW w:w="900" w:type="dxa"/>
@@ -18615,12 +17094,6 @@
         </w:tc>
       </w:tr>
       <w:tr>
-        <w:tblPrEx>
-          <w:tblCellMar>
-            <w:top w:w="0" w:type="dxa"/>
-            <w:bottom w:w="0" w:type="dxa"/>
-          </w:tblCellMar>
-        </w:tblPrEx>
         <w:tc>
           <w:tcPr>
             <w:tcW w:w="900" w:type="dxa"/>
@@ -18707,12 +17180,6 @@
         </w:tc>
       </w:tr>
       <w:tr>
-        <w:tblPrEx>
-          <w:tblCellMar>
-            <w:top w:w="0" w:type="dxa"/>
-            <w:bottom w:w="0" w:type="dxa"/>
-          </w:tblCellMar>
-        </w:tblPrEx>
         <w:tc>
           <w:tcPr>
             <w:tcW w:w="900" w:type="dxa"/>
@@ -18799,12 +17266,6 @@
         </w:tc>
       </w:tr>
       <w:tr>
-        <w:tblPrEx>
-          <w:tblCellMar>
-            <w:top w:w="0" w:type="dxa"/>
-            <w:bottom w:w="0" w:type="dxa"/>
-          </w:tblCellMar>
-        </w:tblPrEx>
         <w:tc>
           <w:tcPr>
             <w:tcW w:w="900" w:type="dxa"/>
@@ -18909,12 +17370,6 @@
         </w:tc>
       </w:tr>
       <w:tr>
-        <w:tblPrEx>
-          <w:tblCellMar>
-            <w:top w:w="0" w:type="dxa"/>
-            <w:bottom w:w="0" w:type="dxa"/>
-          </w:tblCellMar>
-        </w:tblPrEx>
         <w:tc>
           <w:tcPr>
             <w:tcW w:w="900" w:type="dxa"/>
@@ -19001,12 +17456,6 @@
         </w:tc>
       </w:tr>
       <w:tr>
-        <w:tblPrEx>
-          <w:tblCellMar>
-            <w:top w:w="0" w:type="dxa"/>
-            <w:bottom w:w="0" w:type="dxa"/>
-          </w:tblCellMar>
-        </w:tblPrEx>
         <w:tc>
           <w:tcPr>
             <w:tcW w:w="900" w:type="dxa"/>
@@ -19093,12 +17542,6 @@
         </w:tc>
       </w:tr>
       <w:tr>
-        <w:tblPrEx>
-          <w:tblCellMar>
-            <w:top w:w="0" w:type="dxa"/>
-            <w:bottom w:w="0" w:type="dxa"/>
-          </w:tblCellMar>
-        </w:tblPrEx>
         <w:tc>
           <w:tcPr>
             <w:tcW w:w="900" w:type="dxa"/>
@@ -19185,12 +17628,6 @@
         </w:tc>
       </w:tr>
       <w:tr>
-        <w:tblPrEx>
-          <w:tblCellMar>
-            <w:top w:w="0" w:type="dxa"/>
-            <w:bottom w:w="0" w:type="dxa"/>
-          </w:tblCellMar>
-        </w:tblPrEx>
         <w:tc>
           <w:tcPr>
             <w:tcW w:w="900" w:type="dxa"/>
@@ -19278,12 +17715,6 @@
         </w:tc>
       </w:tr>
       <w:tr>
-        <w:tblPrEx>
-          <w:tblCellMar>
-            <w:top w:w="0" w:type="dxa"/>
-            <w:bottom w:w="0" w:type="dxa"/>
-          </w:tblCellMar>
-        </w:tblPrEx>
         <w:tc>
           <w:tcPr>
             <w:tcW w:w="900" w:type="dxa"/>
@@ -19370,12 +17801,6 @@
         </w:tc>
       </w:tr>
       <w:tr>
-        <w:tblPrEx>
-          <w:tblCellMar>
-            <w:top w:w="0" w:type="dxa"/>
-            <w:bottom w:w="0" w:type="dxa"/>
-          </w:tblCellMar>
-        </w:tblPrEx>
         <w:tc>
           <w:tcPr>
             <w:tcW w:w="900" w:type="dxa"/>
@@ -19462,12 +17887,6 @@
         </w:tc>
       </w:tr>
       <w:tr>
-        <w:tblPrEx>
-          <w:tblCellMar>
-            <w:top w:w="0" w:type="dxa"/>
-            <w:bottom w:w="0" w:type="dxa"/>
-          </w:tblCellMar>
-        </w:tblPrEx>
         <w:tc>
           <w:tcPr>
             <w:tcW w:w="900" w:type="dxa"/>
@@ -19601,12 +18020,6 @@
         <w:gridCol w:w="4400"/>
       </w:tblGrid>
       <w:tr>
-        <w:tblPrEx>
-          <w:tblCellMar>
-            <w:top w:w="0" w:type="dxa"/>
-            <w:bottom w:w="0" w:type="dxa"/>
-          </w:tblCellMar>
-        </w:tblPrEx>
         <w:trPr>
           <w:tblHeader/>
         </w:trPr>
@@ -19666,12 +18079,6 @@
         </w:tc>
       </w:tr>
       <w:tr>
-        <w:tblPrEx>
-          <w:tblCellMar>
-            <w:top w:w="0" w:type="dxa"/>
-            <w:bottom w:w="0" w:type="dxa"/>
-          </w:tblCellMar>
-        </w:tblPrEx>
         <w:tc>
           <w:tcPr>
             <w:tcW w:w="4600" w:type="dxa"/>
@@ -19716,12 +18123,6 @@
         </w:tc>
       </w:tr>
       <w:tr>
-        <w:tblPrEx>
-          <w:tblCellMar>
-            <w:top w:w="0" w:type="dxa"/>
-            <w:bottom w:w="0" w:type="dxa"/>
-          </w:tblCellMar>
-        </w:tblPrEx>
         <w:tc>
           <w:tcPr>
             <w:tcW w:w="4600" w:type="dxa"/>
@@ -19766,12 +18167,6 @@
         </w:tc>
       </w:tr>
       <w:tr>
-        <w:tblPrEx>
-          <w:tblCellMar>
-            <w:top w:w="0" w:type="dxa"/>
-            <w:bottom w:w="0" w:type="dxa"/>
-          </w:tblCellMar>
-        </w:tblPrEx>
         <w:tc>
           <w:tcPr>
             <w:tcW w:w="4600" w:type="dxa"/>
@@ -19816,12 +18211,6 @@
         </w:tc>
       </w:tr>
       <w:tr>
-        <w:tblPrEx>
-          <w:tblCellMar>
-            <w:top w:w="0" w:type="dxa"/>
-            <w:bottom w:w="0" w:type="dxa"/>
-          </w:tblCellMar>
-        </w:tblPrEx>
         <w:tc>
           <w:tcPr>
             <w:tcW w:w="4600" w:type="dxa"/>
@@ -19866,12 +18255,6 @@
         </w:tc>
       </w:tr>
       <w:tr>
-        <w:tblPrEx>
-          <w:tblCellMar>
-            <w:top w:w="0" w:type="dxa"/>
-            <w:bottom w:w="0" w:type="dxa"/>
-          </w:tblCellMar>
-        </w:tblPrEx>
         <w:tc>
           <w:tcPr>
             <w:tcW w:w="4600" w:type="dxa"/>
@@ -19979,12 +18362,6 @@
         <w:gridCol w:w="3400"/>
       </w:tblGrid>
       <w:tr>
-        <w:tblPrEx>
-          <w:tblCellMar>
-            <w:top w:w="0" w:type="dxa"/>
-            <w:bottom w:w="0" w:type="dxa"/>
-          </w:tblCellMar>
-        </w:tblPrEx>
         <w:trPr>
           <w:tblHeader/>
         </w:trPr>
@@ -20071,12 +18448,6 @@
         </w:tc>
       </w:tr>
       <w:tr>
-        <w:tblPrEx>
-          <w:tblCellMar>
-            <w:top w:w="0" w:type="dxa"/>
-            <w:bottom w:w="0" w:type="dxa"/>
-          </w:tblCellMar>
-        </w:tblPrEx>
         <w:tc>
           <w:tcPr>
             <w:tcW w:w="3200" w:type="dxa"/>
@@ -20142,12 +18513,6 @@
         </w:tc>
       </w:tr>
       <w:tr>
-        <w:tblPrEx>
-          <w:tblCellMar>
-            <w:top w:w="0" w:type="dxa"/>
-            <w:bottom w:w="0" w:type="dxa"/>
-          </w:tblCellMar>
-        </w:tblPrEx>
         <w:tc>
           <w:tcPr>
             <w:tcW w:w="3200" w:type="dxa"/>
@@ -20213,12 +18578,6 @@
         </w:tc>
       </w:tr>
       <w:tr>
-        <w:tblPrEx>
-          <w:tblCellMar>
-            <w:top w:w="0" w:type="dxa"/>
-            <w:bottom w:w="0" w:type="dxa"/>
-          </w:tblCellMar>
-        </w:tblPrEx>
         <w:tc>
           <w:tcPr>
             <w:tcW w:w="3200" w:type="dxa"/>
@@ -20285,12 +18644,6 @@
         </w:tc>
       </w:tr>
       <w:tr>
-        <w:tblPrEx>
-          <w:tblCellMar>
-            <w:top w:w="0" w:type="dxa"/>
-            <w:bottom w:w="0" w:type="dxa"/>
-          </w:tblCellMar>
-        </w:tblPrEx>
         <w:tc>
           <w:tcPr>
             <w:tcW w:w="3200" w:type="dxa"/>
@@ -20356,12 +18709,6 @@
         </w:tc>
       </w:tr>
       <w:tr>
-        <w:tblPrEx>
-          <w:tblCellMar>
-            <w:top w:w="0" w:type="dxa"/>
-            <w:bottom w:w="0" w:type="dxa"/>
-          </w:tblCellMar>
-        </w:tblPrEx>
         <w:tc>
           <w:tcPr>
             <w:tcW w:w="3200" w:type="dxa"/>
@@ -20563,12 +18910,6 @@
         <w:gridCol w:w="3500"/>
       </w:tblGrid>
       <w:tr>
-        <w:tblPrEx>
-          <w:tblCellMar>
-            <w:top w:w="0" w:type="dxa"/>
-            <w:bottom w:w="0" w:type="dxa"/>
-          </w:tblCellMar>
-        </w:tblPrEx>
         <w:trPr>
           <w:tblHeader/>
         </w:trPr>
@@ -20655,12 +18996,6 @@
         </w:tc>
       </w:tr>
       <w:tr>
-        <w:tblPrEx>
-          <w:tblCellMar>
-            <w:top w:w="0" w:type="dxa"/>
-            <w:bottom w:w="0" w:type="dxa"/>
-          </w:tblCellMar>
-        </w:tblPrEx>
         <w:tc>
           <w:tcPr>
             <w:tcW w:w="900" w:type="dxa"/>
@@ -20726,12 +19061,6 @@
         </w:tc>
       </w:tr>
       <w:tr>
-        <w:tblPrEx>
-          <w:tblCellMar>
-            <w:top w:w="0" w:type="dxa"/>
-            <w:bottom w:w="0" w:type="dxa"/>
-          </w:tblCellMar>
-        </w:tblPrEx>
         <w:tc>
           <w:tcPr>
             <w:tcW w:w="900" w:type="dxa"/>
@@ -20797,12 +19126,6 @@
         </w:tc>
       </w:tr>
       <w:tr>
-        <w:tblPrEx>
-          <w:tblCellMar>
-            <w:top w:w="0" w:type="dxa"/>
-            <w:bottom w:w="0" w:type="dxa"/>
-          </w:tblCellMar>
-        </w:tblPrEx>
         <w:tc>
           <w:tcPr>
             <w:tcW w:w="900" w:type="dxa"/>
@@ -20868,12 +19191,6 @@
         </w:tc>
       </w:tr>
       <w:tr>
-        <w:tblPrEx>
-          <w:tblCellMar>
-            <w:top w:w="0" w:type="dxa"/>
-            <w:bottom w:w="0" w:type="dxa"/>
-          </w:tblCellMar>
-        </w:tblPrEx>
         <w:tc>
           <w:tcPr>
             <w:tcW w:w="900" w:type="dxa"/>
@@ -21024,12 +19341,6 @@
         <w:gridCol w:w="5500"/>
       </w:tblGrid>
       <w:tr>
-        <w:tblPrEx>
-          <w:tblCellMar>
-            <w:top w:w="0" w:type="dxa"/>
-            <w:bottom w:w="0" w:type="dxa"/>
-          </w:tblCellMar>
-        </w:tblPrEx>
         <w:trPr>
           <w:tblHeader/>
         </w:trPr>
@@ -21116,12 +19427,6 @@
         </w:tc>
       </w:tr>
       <w:tr>
-        <w:tblPrEx>
-          <w:tblCellMar>
-            <w:top w:w="0" w:type="dxa"/>
-            <w:bottom w:w="0" w:type="dxa"/>
-          </w:tblCellMar>
-        </w:tblPrEx>
         <w:tc>
           <w:tcPr>
             <w:tcW w:w="500" w:type="dxa"/>
@@ -21187,12 +19492,6 @@
         </w:tc>
       </w:tr>
       <w:tr>
-        <w:tblPrEx>
-          <w:tblCellMar>
-            <w:top w:w="0" w:type="dxa"/>
-            <w:bottom w:w="0" w:type="dxa"/>
-          </w:tblCellMar>
-        </w:tblPrEx>
         <w:tc>
           <w:tcPr>
             <w:tcW w:w="500" w:type="dxa"/>
@@ -21258,12 +19557,6 @@
         </w:tc>
       </w:tr>
       <w:tr>
-        <w:tblPrEx>
-          <w:tblCellMar>
-            <w:top w:w="0" w:type="dxa"/>
-            <w:bottom w:w="0" w:type="dxa"/>
-          </w:tblCellMar>
-        </w:tblPrEx>
         <w:tc>
           <w:tcPr>
             <w:tcW w:w="500" w:type="dxa"/>
@@ -21329,12 +19622,6 @@
         </w:tc>
       </w:tr>
       <w:tr>
-        <w:tblPrEx>
-          <w:tblCellMar>
-            <w:top w:w="0" w:type="dxa"/>
-            <w:bottom w:w="0" w:type="dxa"/>
-          </w:tblCellMar>
-        </w:tblPrEx>
         <w:tc>
           <w:tcPr>
             <w:tcW w:w="500" w:type="dxa"/>
@@ -21400,12 +19687,6 @@
         </w:tc>
       </w:tr>
       <w:tr>
-        <w:tblPrEx>
-          <w:tblCellMar>
-            <w:top w:w="0" w:type="dxa"/>
-            <w:bottom w:w="0" w:type="dxa"/>
-          </w:tblCellMar>
-        </w:tblPrEx>
         <w:tc>
           <w:tcPr>
             <w:tcW w:w="500" w:type="dxa"/>
@@ -21471,12 +19752,6 @@
         </w:tc>
       </w:tr>
       <w:tr>
-        <w:tblPrEx>
-          <w:tblCellMar>
-            <w:top w:w="0" w:type="dxa"/>
-            <w:bottom w:w="0" w:type="dxa"/>
-          </w:tblCellMar>
-        </w:tblPrEx>
         <w:tc>
           <w:tcPr>
             <w:tcW w:w="500" w:type="dxa"/>
@@ -21542,12 +19817,6 @@
         </w:tc>
       </w:tr>
       <w:tr>
-        <w:tblPrEx>
-          <w:tblCellMar>
-            <w:top w:w="0" w:type="dxa"/>
-            <w:bottom w:w="0" w:type="dxa"/>
-          </w:tblCellMar>
-        </w:tblPrEx>
         <w:tc>
           <w:tcPr>
             <w:tcW w:w="500" w:type="dxa"/>
@@ -21613,12 +19882,6 @@
         </w:tc>
       </w:tr>
       <w:tr>
-        <w:tblPrEx>
-          <w:tblCellMar>
-            <w:top w:w="0" w:type="dxa"/>
-            <w:bottom w:w="0" w:type="dxa"/>
-          </w:tblCellMar>
-        </w:tblPrEx>
         <w:tc>
           <w:tcPr>
             <w:tcW w:w="500" w:type="dxa"/>
@@ -21684,12 +19947,6 @@
         </w:tc>
       </w:tr>
       <w:tr>
-        <w:tblPrEx>
-          <w:tblCellMar>
-            <w:top w:w="0" w:type="dxa"/>
-            <w:bottom w:w="0" w:type="dxa"/>
-          </w:tblCellMar>
-        </w:tblPrEx>
         <w:tc>
           <w:tcPr>
             <w:tcW w:w="500" w:type="dxa"/>
@@ -21755,12 +20012,6 @@
         </w:tc>
       </w:tr>
       <w:tr>
-        <w:tblPrEx>
-          <w:tblCellMar>
-            <w:top w:w="0" w:type="dxa"/>
-            <w:bottom w:w="0" w:type="dxa"/>
-          </w:tblCellMar>
-        </w:tblPrEx>
         <w:tc>
           <w:tcPr>
             <w:tcW w:w="500" w:type="dxa"/>
@@ -22144,12 +20395,6 @@
         <w:gridCol w:w="3200"/>
       </w:tblGrid>
       <w:tr>
-        <w:tblPrEx>
-          <w:tblCellMar>
-            <w:top w:w="0" w:type="dxa"/>
-            <w:bottom w:w="0" w:type="dxa"/>
-          </w:tblCellMar>
-        </w:tblPrEx>
         <w:trPr>
           <w:tblHeader/>
         </w:trPr>
@@ -22209,12 +20454,6 @@
         </w:tc>
       </w:tr>
       <w:tr>
-        <w:tblPrEx>
-          <w:tblCellMar>
-            <w:top w:w="0" w:type="dxa"/>
-            <w:bottom w:w="0" w:type="dxa"/>
-          </w:tblCellMar>
-        </w:tblPrEx>
         <w:tc>
           <w:tcPr>
             <w:tcW w:w="5800" w:type="dxa"/>
@@ -22259,12 +20498,6 @@
         </w:tc>
       </w:tr>
       <w:tr>
-        <w:tblPrEx>
-          <w:tblCellMar>
-            <w:top w:w="0" w:type="dxa"/>
-            <w:bottom w:w="0" w:type="dxa"/>
-          </w:tblCellMar>
-        </w:tblPrEx>
         <w:tc>
           <w:tcPr>
             <w:tcW w:w="5800" w:type="dxa"/>
@@ -22309,12 +20542,6 @@
         </w:tc>
       </w:tr>
       <w:tr>
-        <w:tblPrEx>
-          <w:tblCellMar>
-            <w:top w:w="0" w:type="dxa"/>
-            <w:bottom w:w="0" w:type="dxa"/>
-          </w:tblCellMar>
-        </w:tblPrEx>
         <w:tc>
           <w:tcPr>
             <w:tcW w:w="5800" w:type="dxa"/>
@@ -22359,12 +20586,6 @@
         </w:tc>
       </w:tr>
       <w:tr>
-        <w:tblPrEx>
-          <w:tblCellMar>
-            <w:top w:w="0" w:type="dxa"/>
-            <w:bottom w:w="0" w:type="dxa"/>
-          </w:tblCellMar>
-        </w:tblPrEx>
         <w:tc>
           <w:tcPr>
             <w:tcW w:w="5800" w:type="dxa"/>
@@ -22409,12 +20630,6 @@
         </w:tc>
       </w:tr>
       <w:tr>
-        <w:tblPrEx>
-          <w:tblCellMar>
-            <w:top w:w="0" w:type="dxa"/>
-            <w:bottom w:w="0" w:type="dxa"/>
-          </w:tblCellMar>
-        </w:tblPrEx>
         <w:tc>
           <w:tcPr>
             <w:tcW w:w="5800" w:type="dxa"/>
@@ -22459,12 +20674,6 @@
         </w:tc>
       </w:tr>
       <w:tr>
-        <w:tblPrEx>
-          <w:tblCellMar>
-            <w:top w:w="0" w:type="dxa"/>
-            <w:bottom w:w="0" w:type="dxa"/>
-          </w:tblCellMar>
-        </w:tblPrEx>
         <w:tc>
           <w:tcPr>
             <w:tcW w:w="5800" w:type="dxa"/>
@@ -22509,12 +20718,6 @@
         </w:tc>
       </w:tr>
       <w:tr>
-        <w:tblPrEx>
-          <w:tblCellMar>
-            <w:top w:w="0" w:type="dxa"/>
-            <w:bottom w:w="0" w:type="dxa"/>
-          </w:tblCellMar>
-        </w:tblPrEx>
         <w:tc>
           <w:tcPr>
             <w:tcW w:w="5800" w:type="dxa"/>
@@ -22826,12 +21029,6 @@
         <w:gridCol w:w="4535"/>
       </w:tblGrid>
       <w:tr>
-        <w:tblPrEx>
-          <w:tblCellMar>
-            <w:top w:w="0" w:type="dxa"/>
-            <w:bottom w:w="0" w:type="dxa"/>
-          </w:tblCellMar>
-        </w:tblPrEx>
         <w:trPr>
           <w:jc w:val="center"/>
         </w:trPr>
@@ -23008,12 +21205,6 @@
         </w:tc>
       </w:tr>
       <w:tr>
-        <w:tblPrEx>
-          <w:tblCellMar>
-            <w:top w:w="0" w:type="dxa"/>
-            <w:bottom w:w="0" w:type="dxa"/>
-          </w:tblCellMar>
-        </w:tblPrEx>
         <w:trPr>
           <w:jc w:val="center"/>
         </w:trPr>
@@ -23190,12 +21381,6 @@
         </w:tc>
       </w:tr>
       <w:tr>
-        <w:tblPrEx>
-          <w:tblCellMar>
-            <w:top w:w="0" w:type="dxa"/>
-            <w:bottom w:w="0" w:type="dxa"/>
-          </w:tblCellMar>
-        </w:tblPrEx>
         <w:trPr>
           <w:jc w:val="center"/>
         </w:trPr>
@@ -23372,12 +21557,6 @@
         </w:tc>
       </w:tr>
       <w:tr>
-        <w:tblPrEx>
-          <w:tblCellMar>
-            <w:top w:w="0" w:type="dxa"/>
-            <w:bottom w:w="0" w:type="dxa"/>
-          </w:tblCellMar>
-        </w:tblPrEx>
         <w:trPr>
           <w:jc w:val="center"/>
         </w:trPr>
@@ -23554,12 +21733,6 @@
         </w:tc>
       </w:tr>
       <w:tr>
-        <w:tblPrEx>
-          <w:tblCellMar>
-            <w:top w:w="0" w:type="dxa"/>
-            <w:bottom w:w="0" w:type="dxa"/>
-          </w:tblCellMar>
-        </w:tblPrEx>
         <w:trPr>
           <w:jc w:val="center"/>
         </w:trPr>
@@ -23736,12 +21909,6 @@
         </w:tc>
       </w:tr>
       <w:tr>
-        <w:tblPrEx>
-          <w:tblCellMar>
-            <w:top w:w="0" w:type="dxa"/>
-            <w:bottom w:w="0" w:type="dxa"/>
-          </w:tblCellMar>
-        </w:tblPrEx>
         <w:trPr>
           <w:jc w:val="center"/>
         </w:trPr>
@@ -23966,12 +22133,6 @@
         <w:gridCol w:w="3400"/>
       </w:tblGrid>
       <w:tr>
-        <w:tblPrEx>
-          <w:tblCellMar>
-            <w:top w:w="0" w:type="dxa"/>
-            <w:bottom w:w="0" w:type="dxa"/>
-          </w:tblCellMar>
-        </w:tblPrEx>
         <w:trPr>
           <w:tblHeader/>
         </w:trPr>
@@ -24058,12 +22219,6 @@
         </w:tc>
       </w:tr>
       <w:tr>
-        <w:tblPrEx>
-          <w:tblCellMar>
-            <w:top w:w="0" w:type="dxa"/>
-            <w:bottom w:w="0" w:type="dxa"/>
-          </w:tblCellMar>
-        </w:tblPrEx>
         <w:tc>
           <w:tcPr>
             <w:tcW w:w="1400" w:type="dxa"/>
@@ -24129,12 +22284,6 @@
         </w:tc>
       </w:tr>
       <w:tr>
-        <w:tblPrEx>
-          <w:tblCellMar>
-            <w:top w:w="0" w:type="dxa"/>
-            <w:bottom w:w="0" w:type="dxa"/>
-          </w:tblCellMar>
-        </w:tblPrEx>
         <w:tc>
           <w:tcPr>
             <w:tcW w:w="1400" w:type="dxa"/>
@@ -24200,12 +22349,6 @@
         </w:tc>
       </w:tr>
       <w:tr>
-        <w:tblPrEx>
-          <w:tblCellMar>
-            <w:top w:w="0" w:type="dxa"/>
-            <w:bottom w:w="0" w:type="dxa"/>
-          </w:tblCellMar>
-        </w:tblPrEx>
         <w:tc>
           <w:tcPr>
             <w:tcW w:w="1400" w:type="dxa"/>
@@ -24271,12 +22414,6 @@
         </w:tc>
       </w:tr>
       <w:tr>
-        <w:tblPrEx>
-          <w:tblCellMar>
-            <w:top w:w="0" w:type="dxa"/>
-            <w:bottom w:w="0" w:type="dxa"/>
-          </w:tblCellMar>
-        </w:tblPrEx>
         <w:tc>
           <w:tcPr>
             <w:tcW w:w="1400" w:type="dxa"/>
@@ -24342,12 +22479,6 @@
         </w:tc>
       </w:tr>
       <w:tr>
-        <w:tblPrEx>
-          <w:tblCellMar>
-            <w:top w:w="0" w:type="dxa"/>
-            <w:bottom w:w="0" w:type="dxa"/>
-          </w:tblCellMar>
-        </w:tblPrEx>
         <w:tc>
           <w:tcPr>
             <w:tcW w:w="1400" w:type="dxa"/>
@@ -24413,12 +22544,6 @@
         </w:tc>
       </w:tr>
       <w:tr>
-        <w:tblPrEx>
-          <w:tblCellMar>
-            <w:top w:w="0" w:type="dxa"/>
-            <w:bottom w:w="0" w:type="dxa"/>
-          </w:tblCellMar>
-        </w:tblPrEx>
         <w:tc>
           <w:tcPr>
             <w:tcW w:w="1400" w:type="dxa"/>
@@ -24485,12 +22610,6 @@
         </w:tc>
       </w:tr>
       <w:tr>
-        <w:tblPrEx>
-          <w:tblCellMar>
-            <w:top w:w="0" w:type="dxa"/>
-            <w:bottom w:w="0" w:type="dxa"/>
-          </w:tblCellMar>
-        </w:tblPrEx>
         <w:tc>
           <w:tcPr>
             <w:tcW w:w="1400" w:type="dxa"/>
@@ -24556,12 +22675,6 @@
         </w:tc>
       </w:tr>
       <w:tr>
-        <w:tblPrEx>
-          <w:tblCellMar>
-            <w:top w:w="0" w:type="dxa"/>
-            <w:bottom w:w="0" w:type="dxa"/>
-          </w:tblCellMar>
-        </w:tblPrEx>
         <w:tc>
           <w:tcPr>
             <w:tcW w:w="1400" w:type="dxa"/>
@@ -24627,12 +22740,6 @@
         </w:tc>
       </w:tr>
       <w:tr>
-        <w:tblPrEx>
-          <w:tblCellMar>
-            <w:top w:w="0" w:type="dxa"/>
-            <w:bottom w:w="0" w:type="dxa"/>
-          </w:tblCellMar>
-        </w:tblPrEx>
         <w:tc>
           <w:tcPr>
             <w:tcW w:w="1400" w:type="dxa"/>
@@ -24698,12 +22805,6 @@
         </w:tc>
       </w:tr>
       <w:tr>
-        <w:tblPrEx>
-          <w:tblCellMar>
-            <w:top w:w="0" w:type="dxa"/>
-            <w:bottom w:w="0" w:type="dxa"/>
-          </w:tblCellMar>
-        </w:tblPrEx>
         <w:tc>
           <w:tcPr>
             <w:tcW w:w="1400" w:type="dxa"/>
@@ -25346,12 +23447,6 @@
         <w:gridCol w:w="6600"/>
       </w:tblGrid>
       <w:tr>
-        <w:tblPrEx>
-          <w:tblCellMar>
-            <w:top w:w="0" w:type="dxa"/>
-            <w:bottom w:w="0" w:type="dxa"/>
-          </w:tblCellMar>
-        </w:tblPrEx>
         <w:trPr>
           <w:tblHeader/>
         </w:trPr>
@@ -25411,12 +23506,6 @@
         </w:tc>
       </w:tr>
       <w:tr>
-        <w:tblPrEx>
-          <w:tblCellMar>
-            <w:top w:w="0" w:type="dxa"/>
-            <w:bottom w:w="0" w:type="dxa"/>
-          </w:tblCellMar>
-        </w:tblPrEx>
         <w:tc>
           <w:tcPr>
             <w:tcW w:w="2400" w:type="dxa"/>
@@ -25461,12 +23550,6 @@
         </w:tc>
       </w:tr>
       <w:tr>
-        <w:tblPrEx>
-          <w:tblCellMar>
-            <w:top w:w="0" w:type="dxa"/>
-            <w:bottom w:w="0" w:type="dxa"/>
-          </w:tblCellMar>
-        </w:tblPrEx>
         <w:tc>
           <w:tcPr>
             <w:tcW w:w="2400" w:type="dxa"/>
@@ -25511,12 +23594,6 @@
         </w:tc>
       </w:tr>
       <w:tr>
-        <w:tblPrEx>
-          <w:tblCellMar>
-            <w:top w:w="0" w:type="dxa"/>
-            <w:bottom w:w="0" w:type="dxa"/>
-          </w:tblCellMar>
-        </w:tblPrEx>
         <w:tc>
           <w:tcPr>
             <w:tcW w:w="2400" w:type="dxa"/>
@@ -25561,12 +23638,6 @@
         </w:tc>
       </w:tr>
       <w:tr>
-        <w:tblPrEx>
-          <w:tblCellMar>
-            <w:top w:w="0" w:type="dxa"/>
-            <w:bottom w:w="0" w:type="dxa"/>
-          </w:tblCellMar>
-        </w:tblPrEx>
         <w:tc>
           <w:tcPr>
             <w:tcW w:w="2400" w:type="dxa"/>
@@ -25611,12 +23682,6 @@
         </w:tc>
       </w:tr>
       <w:tr>
-        <w:tblPrEx>
-          <w:tblCellMar>
-            <w:top w:w="0" w:type="dxa"/>
-            <w:bottom w:w="0" w:type="dxa"/>
-          </w:tblCellMar>
-        </w:tblPrEx>
         <w:tc>
           <w:tcPr>
             <w:tcW w:w="2400" w:type="dxa"/>
@@ -25661,12 +23726,6 @@
         </w:tc>
       </w:tr>
       <w:tr>
-        <w:tblPrEx>
-          <w:tblCellMar>
-            <w:top w:w="0" w:type="dxa"/>
-            <w:bottom w:w="0" w:type="dxa"/>
-          </w:tblCellMar>
-        </w:tblPrEx>
         <w:tc>
           <w:tcPr>
             <w:tcW w:w="2400" w:type="dxa"/>
@@ -25711,12 +23770,6 @@
         </w:tc>
       </w:tr>
       <w:tr>
-        <w:tblPrEx>
-          <w:tblCellMar>
-            <w:top w:w="0" w:type="dxa"/>
-            <w:bottom w:w="0" w:type="dxa"/>
-          </w:tblCellMar>
-        </w:tblPrEx>
         <w:tc>
           <w:tcPr>
             <w:tcW w:w="2400" w:type="dxa"/>
@@ -25761,12 +23814,6 @@
         </w:tc>
       </w:tr>
       <w:tr>
-        <w:tblPrEx>
-          <w:tblCellMar>
-            <w:top w:w="0" w:type="dxa"/>
-            <w:bottom w:w="0" w:type="dxa"/>
-          </w:tblCellMar>
-        </w:tblPrEx>
         <w:tc>
           <w:tcPr>
             <w:tcW w:w="2400" w:type="dxa"/>
@@ -25812,12 +23859,6 @@
         </w:tc>
       </w:tr>
       <w:tr>
-        <w:tblPrEx>
-          <w:tblCellMar>
-            <w:top w:w="0" w:type="dxa"/>
-            <w:bottom w:w="0" w:type="dxa"/>
-          </w:tblCellMar>
-        </w:tblPrEx>
         <w:tc>
           <w:tcPr>
             <w:tcW w:w="2400" w:type="dxa"/>
@@ -25862,12 +23903,6 @@
         </w:tc>
       </w:tr>
       <w:tr>
-        <w:tblPrEx>
-          <w:tblCellMar>
-            <w:top w:w="0" w:type="dxa"/>
-            <w:bottom w:w="0" w:type="dxa"/>
-          </w:tblCellMar>
-        </w:tblPrEx>
         <w:tc>
           <w:tcPr>
             <w:tcW w:w="2400" w:type="dxa"/>
@@ -25912,12 +23947,6 @@
         </w:tc>
       </w:tr>
       <w:tr>
-        <w:tblPrEx>
-          <w:tblCellMar>
-            <w:top w:w="0" w:type="dxa"/>
-            <w:bottom w:w="0" w:type="dxa"/>
-          </w:tblCellMar>
-        </w:tblPrEx>
         <w:tc>
           <w:tcPr>
             <w:tcW w:w="2400" w:type="dxa"/>
@@ -25962,12 +23991,6 @@
         </w:tc>
       </w:tr>
       <w:tr>
-        <w:tblPrEx>
-          <w:tblCellMar>
-            <w:top w:w="0" w:type="dxa"/>
-            <w:bottom w:w="0" w:type="dxa"/>
-          </w:tblCellMar>
-        </w:tblPrEx>
         <w:tc>
           <w:tcPr>
             <w:tcW w:w="2400" w:type="dxa"/>
@@ -26012,12 +24035,6 @@
         </w:tc>
       </w:tr>
       <w:tr>
-        <w:tblPrEx>
-          <w:tblCellMar>
-            <w:top w:w="0" w:type="dxa"/>
-            <w:bottom w:w="0" w:type="dxa"/>
-          </w:tblCellMar>
-        </w:tblPrEx>
         <w:tc>
           <w:tcPr>
             <w:tcW w:w="2400" w:type="dxa"/>
@@ -26109,12 +24126,6 @@
         <w:gridCol w:w="7400"/>
       </w:tblGrid>
       <w:tr>
-        <w:tblPrEx>
-          <w:tblCellMar>
-            <w:top w:w="0" w:type="dxa"/>
-            <w:bottom w:w="0" w:type="dxa"/>
-          </w:tblCellMar>
-        </w:tblPrEx>
         <w:trPr>
           <w:tblHeader/>
         </w:trPr>
@@ -26174,12 +24185,6 @@
         </w:tc>
       </w:tr>
       <w:tr>
-        <w:tblPrEx>
-          <w:tblCellMar>
-            <w:top w:w="0" w:type="dxa"/>
-            <w:bottom w:w="0" w:type="dxa"/>
-          </w:tblCellMar>
-        </w:tblPrEx>
         <w:tc>
           <w:tcPr>
             <w:tcW w:w="1600" w:type="dxa"/>
@@ -26224,12 +24229,6 @@
         </w:tc>
       </w:tr>
       <w:tr>
-        <w:tblPrEx>
-          <w:tblCellMar>
-            <w:top w:w="0" w:type="dxa"/>
-            <w:bottom w:w="0" w:type="dxa"/>
-          </w:tblCellMar>
-        </w:tblPrEx>
         <w:tc>
           <w:tcPr>
             <w:tcW w:w="1600" w:type="dxa"/>
@@ -26274,12 +24273,6 @@
         </w:tc>
       </w:tr>
       <w:tr>
-        <w:tblPrEx>
-          <w:tblCellMar>
-            <w:top w:w="0" w:type="dxa"/>
-            <w:bottom w:w="0" w:type="dxa"/>
-          </w:tblCellMar>
-        </w:tblPrEx>
         <w:tc>
           <w:tcPr>
             <w:tcW w:w="1600" w:type="dxa"/>
@@ -26324,12 +24317,6 @@
         </w:tc>
       </w:tr>
       <w:tr>
-        <w:tblPrEx>
-          <w:tblCellMar>
-            <w:top w:w="0" w:type="dxa"/>
-            <w:bottom w:w="0" w:type="dxa"/>
-          </w:tblCellMar>
-        </w:tblPrEx>
         <w:tc>
           <w:tcPr>
             <w:tcW w:w="1600" w:type="dxa"/>
@@ -26744,12 +24731,6 @@
         <w:gridCol w:w="3600"/>
       </w:tblGrid>
       <w:tr>
-        <w:tblPrEx>
-          <w:tblCellMar>
-            <w:top w:w="0" w:type="dxa"/>
-            <w:bottom w:w="0" w:type="dxa"/>
-          </w:tblCellMar>
-        </w:tblPrEx>
         <w:trPr>
           <w:tblHeader/>
         </w:trPr>
@@ -26836,12 +24817,6 @@
         </w:tc>
       </w:tr>
       <w:tr>
-        <w:tblPrEx>
-          <w:tblCellMar>
-            <w:top w:w="0" w:type="dxa"/>
-            <w:bottom w:w="0" w:type="dxa"/>
-          </w:tblCellMar>
-        </w:tblPrEx>
         <w:tc>
           <w:tcPr>
             <w:tcW w:w="3600" w:type="dxa"/>
@@ -26907,12 +24882,6 @@
         </w:tc>
       </w:tr>
       <w:tr>
-        <w:tblPrEx>
-          <w:tblCellMar>
-            <w:top w:w="0" w:type="dxa"/>
-            <w:bottom w:w="0" w:type="dxa"/>
-          </w:tblCellMar>
-        </w:tblPrEx>
         <w:tc>
           <w:tcPr>
             <w:tcW w:w="3600" w:type="dxa"/>
@@ -26978,12 +24947,6 @@
         </w:tc>
       </w:tr>
       <w:tr>
-        <w:tblPrEx>
-          <w:tblCellMar>
-            <w:top w:w="0" w:type="dxa"/>
-            <w:bottom w:w="0" w:type="dxa"/>
-          </w:tblCellMar>
-        </w:tblPrEx>
         <w:tc>
           <w:tcPr>
             <w:tcW w:w="3600" w:type="dxa"/>
@@ -27049,12 +25012,6 @@
         </w:tc>
       </w:tr>
       <w:tr>
-        <w:tblPrEx>
-          <w:tblCellMar>
-            <w:top w:w="0" w:type="dxa"/>
-            <w:bottom w:w="0" w:type="dxa"/>
-          </w:tblCellMar>
-        </w:tblPrEx>
         <w:tc>
           <w:tcPr>
             <w:tcW w:w="3600" w:type="dxa"/>
@@ -27120,12 +25077,6 @@
         </w:tc>
       </w:tr>
       <w:tr>
-        <w:tblPrEx>
-          <w:tblCellMar>
-            <w:top w:w="0" w:type="dxa"/>
-            <w:bottom w:w="0" w:type="dxa"/>
-          </w:tblCellMar>
-        </w:tblPrEx>
         <w:tc>
           <w:tcPr>
             <w:tcW w:w="3600" w:type="dxa"/>
@@ -27239,12 +25190,6 @@
         <w:gridCol w:w="3000"/>
       </w:tblGrid>
       <w:tr>
-        <w:tblPrEx>
-          <w:tblCellMar>
-            <w:top w:w="0" w:type="dxa"/>
-            <w:bottom w:w="0" w:type="dxa"/>
-          </w:tblCellMar>
-        </w:tblPrEx>
         <w:trPr>
           <w:tblHeader/>
         </w:trPr>
@@ -27332,12 +25277,6 @@
         </w:tc>
       </w:tr>
       <w:tr>
-        <w:tblPrEx>
-          <w:tblCellMar>
-            <w:top w:w="0" w:type="dxa"/>
-            <w:bottom w:w="0" w:type="dxa"/>
-          </w:tblCellMar>
-        </w:tblPrEx>
         <w:tc>
           <w:tcPr>
             <w:tcW w:w="3800" w:type="dxa"/>
@@ -27403,12 +25342,6 @@
         </w:tc>
       </w:tr>
       <w:tr>
-        <w:tblPrEx>
-          <w:tblCellMar>
-            <w:top w:w="0" w:type="dxa"/>
-            <w:bottom w:w="0" w:type="dxa"/>
-          </w:tblCellMar>
-        </w:tblPrEx>
         <w:tc>
           <w:tcPr>
             <w:tcW w:w="3800" w:type="dxa"/>
@@ -27474,12 +25407,6 @@
         </w:tc>
       </w:tr>
       <w:tr>
-        <w:tblPrEx>
-          <w:tblCellMar>
-            <w:top w:w="0" w:type="dxa"/>
-            <w:bottom w:w="0" w:type="dxa"/>
-          </w:tblCellMar>
-        </w:tblPrEx>
         <w:tc>
           <w:tcPr>
             <w:tcW w:w="3800" w:type="dxa"/>
@@ -27545,12 +25472,6 @@
         </w:tc>
       </w:tr>
       <w:tr>
-        <w:tblPrEx>
-          <w:tblCellMar>
-            <w:top w:w="0" w:type="dxa"/>
-            <w:bottom w:w="0" w:type="dxa"/>
-          </w:tblCellMar>
-        </w:tblPrEx>
         <w:tc>
           <w:tcPr>
             <w:tcW w:w="3800" w:type="dxa"/>
@@ -27616,12 +25537,6 @@
         </w:tc>
       </w:tr>
       <w:tr>
-        <w:tblPrEx>
-          <w:tblCellMar>
-            <w:top w:w="0" w:type="dxa"/>
-            <w:bottom w:w="0" w:type="dxa"/>
-          </w:tblCellMar>
-        </w:tblPrEx>
         <w:tc>
           <w:tcPr>
             <w:tcW w:w="3800" w:type="dxa"/>
@@ -27687,12 +25602,6 @@
         </w:tc>
       </w:tr>
       <w:tr>
-        <w:tblPrEx>
-          <w:tblCellMar>
-            <w:top w:w="0" w:type="dxa"/>
-            <w:bottom w:w="0" w:type="dxa"/>
-          </w:tblCellMar>
-        </w:tblPrEx>
         <w:tc>
           <w:tcPr>
             <w:tcW w:w="3800" w:type="dxa"/>
@@ -27763,12 +25672,6 @@
         </w:tc>
       </w:tr>
       <w:tr>
-        <w:tblPrEx>
-          <w:tblCellMar>
-            <w:top w:w="0" w:type="dxa"/>
-            <w:bottom w:w="0" w:type="dxa"/>
-          </w:tblCellMar>
-        </w:tblPrEx>
         <w:tc>
           <w:tcPr>
             <w:tcW w:w="3800" w:type="dxa"/>
@@ -28687,7 +26590,6 @@
   <w:style w:type="character" w:default="1" w:styleId="DefaultParagraphFont">
     <w:name w:val="Default Paragraph Font"/>
     <w:uiPriority w:val="1"/>
-    <w:semiHidden/>
     <w:unhideWhenUsed/>
   </w:style>
   <w:style w:type="table" w:default="1" w:styleId="TableNormal">

</xml_diff>